<commit_message>
Expand Ass6 literature and methods from Assignment 4
</commit_message>
<xml_diff>
--- a/ass6_output/Residential_Intelligence_Computer_Project_Proposal_READY_2026-10-18.docx
+++ b/ass6_output/Residential_Intelligence_Computer_Project_Proposal_READY_2026-10-18.docx
@@ -5,7 +5,7 @@
     <w:p>
       <w:pPr>
         <w:pStyle w:val="Title"/>
-        <w:keepLines w:val="0"/>
+        <w:keepLines/>
         <w:jc w:val="center"/>
       </w:pPr>
       <w:r>
@@ -17,7 +17,7 @@
     </w:p>
     <w:p>
       <w:pPr>
-        <w:keepLines w:val="0"/>
+        <w:keepLines/>
         <w:jc w:val="center"/>
       </w:pPr>
       <w:r>
@@ -29,7 +29,7 @@
     </w:p>
     <w:p>
       <w:pPr>
-        <w:keepLines w:val="0"/>
+        <w:keepLines/>
       </w:pPr>
       <w:r>
         <w:rPr>
@@ -40,7 +40,7 @@
     </w:p>
     <w:p>
       <w:pPr>
-        <w:keepLines w:val="0"/>
+        <w:keepLines/>
       </w:pPr>
       <w:r>
         <w:rPr>
@@ -51,7 +51,7 @@
     </w:p>
     <w:p>
       <w:pPr>
-        <w:keepLines w:val="0"/>
+        <w:keepLines/>
       </w:pPr>
       <w:r>
         <w:rPr>
@@ -62,7 +62,7 @@
     </w:p>
     <w:p>
       <w:pPr>
-        <w:keepLines w:val="0"/>
+        <w:keepLines/>
       </w:pPr>
       <w:r>
         <w:rPr>
@@ -75,7 +75,7 @@
       <w:pPr>
         <w:pStyle w:val="Heading1"/>
         <w:keepNext/>
-        <w:keepLines w:val="0"/>
+        <w:keepLines/>
       </w:pPr>
       <w:r>
         <w:rPr>
@@ -86,7 +86,7 @@
     </w:p>
     <w:p>
       <w:pPr>
-        <w:keepLines w:val="0"/>
+        <w:keepLines/>
       </w:pPr>
       <w:r>
         <w:rPr>
@@ -97,7 +97,7 @@
     </w:p>
     <w:p>
       <w:pPr>
-        <w:keepLines w:val="0"/>
+        <w:keepLines/>
       </w:pPr>
       <w:r>
         <w:rPr>
@@ -110,7 +110,7 @@
       <w:pPr>
         <w:pStyle w:val="Heading1"/>
         <w:keepNext/>
-        <w:keepLines w:val="0"/>
+        <w:keepLines/>
       </w:pPr>
       <w:r>
         <w:rPr>
@@ -121,7 +121,7 @@
     </w:p>
     <w:p>
       <w:pPr>
-        <w:keepLines w:val="0"/>
+        <w:keepLines/>
       </w:pPr>
       <w:r>
         <w:rPr>
@@ -132,7 +132,7 @@
     </w:p>
     <w:p>
       <w:pPr>
-        <w:keepLines w:val="0"/>
+        <w:keepLines/>
       </w:pPr>
       <w:r>
         <w:rPr>
@@ -143,7 +143,7 @@
     </w:p>
     <w:p>
       <w:pPr>
-        <w:keepLines w:val="0"/>
+        <w:keepLines/>
       </w:pPr>
       <w:r>
         <w:rPr>
@@ -154,7 +154,7 @@
     </w:p>
     <w:p>
       <w:pPr>
-        <w:keepLines w:val="0"/>
+        <w:keepLines/>
       </w:pPr>
       <w:r>
         <w:rPr>
@@ -165,7 +165,7 @@
     </w:p>
     <w:p>
       <w:pPr>
-        <w:keepLines w:val="0"/>
+        <w:keepLines/>
       </w:pPr>
       <w:r>
         <w:rPr>
@@ -178,7 +178,7 @@
       <w:pPr>
         <w:pStyle w:val="Heading1"/>
         <w:keepNext/>
-        <w:keepLines w:val="0"/>
+        <w:keepLines/>
       </w:pPr>
       <w:r>
         <w:rPr>
@@ -189,7 +189,7 @@
     </w:p>
     <w:p>
       <w:pPr>
-        <w:keepLines w:val="0"/>
+        <w:keepLines/>
         <w:ind w:left="360" w:hanging="259"/>
       </w:pPr>
       <w:r>
@@ -201,7 +201,7 @@
     </w:p>
     <w:p>
       <w:pPr>
-        <w:keepLines w:val="0"/>
+        <w:keepLines/>
         <w:ind w:left="360" w:hanging="259"/>
       </w:pPr>
       <w:r>
@@ -213,7 +213,7 @@
     </w:p>
     <w:p>
       <w:pPr>
-        <w:keepLines w:val="0"/>
+        <w:keepLines/>
         <w:ind w:left="360" w:hanging="259"/>
       </w:pPr>
       <w:r>
@@ -225,7 +225,7 @@
     </w:p>
     <w:p>
       <w:pPr>
-        <w:keepLines w:val="0"/>
+        <w:keepLines/>
         <w:ind w:left="360" w:hanging="259"/>
       </w:pPr>
       <w:r>
@@ -239,7 +239,7 @@
       <w:pPr>
         <w:pStyle w:val="Heading1"/>
         <w:keepNext/>
-        <w:keepLines w:val="0"/>
+        <w:keepLines/>
       </w:pPr>
       <w:r>
         <w:rPr>
@@ -252,7 +252,7 @@
       <w:pPr>
         <w:pStyle w:val="Heading2"/>
         <w:keepNext/>
-        <w:keepLines w:val="0"/>
+        <w:keepLines/>
         <w:ind w:left="360"/>
       </w:pPr>
       <w:r>
@@ -264,7 +264,7 @@
     </w:p>
     <w:p>
       <w:pPr>
-        <w:keepLines w:val="0"/>
+        <w:keepLines/>
       </w:pPr>
       <w:r>
         <w:rPr>
@@ -275,20 +275,20 @@
     </w:p>
     <w:p>
       <w:pPr>
-        <w:keepLines w:val="0"/>
+        <w:keepLines/>
       </w:pPr>
       <w:r>
         <w:rPr>
           <w:rFonts w:ascii="TH Sarabun New" w:hAnsi="TH Sarabun New" w:eastAsia="TH Sarabun New" w:cs="TH Sarabun New"/>
         </w:rPr>
-        <w:t>Assignment 4 เปรียบเทียบงานกลุ่ม quantization/hardware โดยชี้ว่าผลจาก Raspberry Pi, Jetson และ GPU ระดับศูนย์ข้อมูลถ่ายโอนมาใช้กับเครื่องเป้าหมายโดยตรงไม่ได้ งานของ Giedra และคณะเสนอให้พิจารณาความแม่นยำร่วมกับพลังงานในแต่ละชุด model-configuration ส่วน ShadowNPU เป็นแนวคิดเรื่องการแบ่งภาระระหว่างตัวเร่งกับ CPU [2, 12, 17] โครงงานจึงจะบันทึกค่ารุ่นโมเดล ระดับบีบอัด และเครื่องที่ทดสอบเป็นคู่กับผล JSON เสมอ; การแบ่งชั้นโมเดลแบบ ShadowNPU ยังเป็นแนวทางศึกษา ไม่ใช่สิ่งที่พัฒนาได้แล้ว</w:t>
+        <w:t>รายงานทบทวนวรรณกรรมเดิมเปรียบเทียบงานกลุ่ม quantization/hardware โดยชี้ว่าผลจาก Raspberry Pi, Jetson และ GPU ระดับศูนย์ข้อมูลถ่ายโอนมาใช้กับเครื่องเป้าหมายโดยตรงไม่ได้ งานของ Giedra และคณะเสนอให้พิจารณาความแม่นยำร่วมกับพลังงานในแต่ละชุด model-configuration ส่วน ShadowNPU เป็นแนวคิดเรื่องการแบ่งภาระระหว่างตัวเร่งกับ CPU [2, 12, 17] โครงงานจึงจะบันทึกรุ่นโมเดล ระดับบีบอัด และเครื่องที่ทดสอบคู่กับผล JSON เสมอ; การแบ่งงานแบบ ShadowNPU ยังเป็นแนวทางศึกษา มิใช่ผลการพัฒนาของโครงงาน</w:t>
       </w:r>
     </w:p>
     <w:p>
       <w:pPr>
         <w:pStyle w:val="Heading2"/>
         <w:keepNext/>
-        <w:keepLines w:val="0"/>
+        <w:keepLines/>
         <w:ind w:left="360"/>
       </w:pPr>
       <w:r>
@@ -300,7 +300,7 @@
     </w:p>
     <w:p>
       <w:pPr>
-        <w:keepLines w:val="0"/>
+        <w:keepLines/>
       </w:pPr>
       <w:r>
         <w:rPr>
@@ -311,20 +311,20 @@
     </w:p>
     <w:p>
       <w:pPr>
-        <w:keepLines w:val="0"/>
+        <w:keepLines/>
       </w:pPr>
       <w:r>
         <w:rPr>
           <w:rFonts w:ascii="TH Sarabun New" w:hAnsi="TH Sarabun New" w:eastAsia="TH Sarabun New" w:cs="TH Sarabun New"/>
         </w:rPr>
-        <w:t>การทบทวนใน Assignment 4 ใช้แนวคิด grammar-constrained decoding และ jump-forward ของ SGLang เป็นแรงจูงใจให้ลดงานที่ต้องสร้างโทเคนซ้ำของคีย์ JSON [3, 12] ระยะทดลองจะเริ่มจากความสามารถของ runtime ที่เลือกจริง แล้วตรวจ parse rate, schema-valid rate และความถูกต้องของค่าแยกกัน; ยังไม่อ้างว่าจะพอร์ตกลไก jump-forward หรือได้ความเร็วเท่าระบบในบทความ</w:t>
+        <w:t>รายงานทบทวนวรรณกรรมเดิมใช้แนวคิด grammar-constrained decoding และ jump-forward ของ SGLang เป็นแรงจูงใจให้ลดงานที่ต้องสร้างโทเคนซ้ำของคีย์ JSON [3, 12] ระยะทดลองจะเริ่มจากความสามารถของ runtime ที่เลือกจริง แล้วตรวจ parse rate, schema-valid rate และความถูกต้องของค่าแยกกัน; ยังไม่อ้างว่าจะพอร์ตกลไก jump-forward หรือได้ความเร็วเท่าระบบในบทความ</w:t>
       </w:r>
     </w:p>
     <w:p>
       <w:pPr>
         <w:pStyle w:val="Heading2"/>
         <w:keepNext/>
-        <w:keepLines w:val="0"/>
+        <w:keepLines/>
         <w:ind w:left="360"/>
       </w:pPr>
       <w:r>
@@ -336,18 +336,18 @@
     </w:p>
     <w:p>
       <w:pPr>
-        <w:keepLines w:val="0"/>
+        <w:keepLines/>
       </w:pPr>
       <w:r>
         <w:rPr>
           <w:rFonts w:ascii="TH Sarabun New" w:hAnsi="TH Sarabun New" w:eastAsia="TH Sarabun New" w:cs="TH Sarabun New"/>
         </w:rPr>
-        <w:t>รายงาน Assignment 4 สังเคราะห์งานบ้านอัจฉริยะสามแนวทาง: ตัวแทน LLM สำหรับควบคุมบ้าน [14], การพยากรณ์ข้อมูล IoT แบบอนุกรมเวลา [15] และเกตเวย์ ESP32 สำหรับการเชื่อมต่อ [16] โครงงานนี้จะส่งเฉพาะข้อมูลรายการซื้อที่ผ่านการตรวจแล้วผ่าน MQTT และแยกข้อมูลการซื้อเข้าออกจากข้อมูลปริมาณคงเหลือ เพราะใบเสร็จเพียงอย่างเดียวไม่บอกอัตราการใช้จริง [12]</w:t>
+        <w:t>รายงานทบทวนวรรณกรรมเดิมสังเคราะห์งานบ้านอัจฉริยะสามแนวทาง: ตัวแทน LLM สำหรับควบคุมบ้าน [14], การพยากรณ์ข้อมูล IoT แบบอนุกรมเวลา [15] และเกตเวย์ ESP32 สำหรับการเชื่อมต่อ [16] โครงงานนี้จะส่งเฉพาะข้อมูลรายการซื้อที่ผ่านการตรวจแล้วผ่าน MQTT และแยกข้อมูลการซื้อเข้าออกจากข้อมูลปริมาณคงเหลือ เพราะใบเสร็จเพียงอย่างเดียวไม่บอกอัตราการใช้จริง [12]</w:t>
       </w:r>
     </w:p>
     <w:p>
       <w:pPr>
-        <w:keepLines w:val="0"/>
+        <w:keepLines/>
       </w:pPr>
       <w:r>
         <w:rPr>
@@ -360,7 +360,7 @@
       <w:pPr>
         <w:pStyle w:val="Heading2"/>
         <w:keepNext/>
-        <w:keepLines w:val="0"/>
+        <w:keepLines/>
         <w:ind w:left="360"/>
       </w:pPr>
       <w:r>
@@ -372,7 +372,7 @@
     </w:p>
     <w:p>
       <w:pPr>
-        <w:keepLines w:val="0"/>
+        <w:keepLines/>
       </w:pPr>
       <w:r>
         <w:rPr>
@@ -385,7 +385,7 @@
       <w:pPr>
         <w:pStyle w:val="Heading2"/>
         <w:keepNext/>
-        <w:keepLines w:val="0"/>
+        <w:keepLines/>
         <w:ind w:left="360"/>
       </w:pPr>
       <w:r>
@@ -769,9 +769,260 @@
     </w:p>
     <w:p>
       <w:pPr>
+        <w:pStyle w:val="Heading2"/>
+        <w:keepNext/>
+        <w:keepLines/>
+        <w:ind w:left="360"/>
+      </w:pPr>
+      <w:r>
+        <w:rPr>
+          <w:rFonts w:ascii="TH Sarabun New" w:hAnsi="TH Sarabun New" w:eastAsia="TH Sarabun New" w:cs="TH Sarabun New"/>
+        </w:rPr>
+        <w:t>4.6  สาระจากงานวิจัย 12 ฉบับที่ใช้เป็นฐาน</w:t>
+      </w:r>
+    </w:p>
+    <w:p>
+      <w:pPr>
+        <w:keepLines/>
+      </w:pPr>
+      <w:r>
+        <w:rPr>
+          <w:rFonts w:ascii="TH Sarabun New" w:hAnsi="TH Sarabun New" w:eastAsia="TH Sarabun New" w:cs="TH Sarabun New"/>
+        </w:rPr>
+        <w:t>รายงานเดิมคัดบทความจาก 57 รายการจนเหลือ 12 ฉบับที่ใช้สังเคราะห์กรอบสามมิติ งานแต่ละฉบับตอบคำถามต่างกัน จึงพิจารณาทั้งวิธีทดลอง ฮาร์ดแวร์ ผลลัพธ์ที่วัด และขอบเขตการนำมาใช้กับระบบใบซื้อสินค้า ไม่รวมคะแนนจากต่างแพลตฟอร์มเป็นผลของโครงงาน [12]</w:t>
+      </w:r>
+    </w:p>
+    <w:p>
+      <w:pPr>
+        <w:keepLines/>
+      </w:pPr>
+      <w:r>
+        <w:rPr>
+          <w:rFonts w:ascii="TH Sarabun New" w:hAnsi="TH Sarabun New" w:eastAsia="TH Sarabun New" w:cs="TH Sarabun New"/>
+        </w:rPr>
+        <w:t>Cai และคณะเสนอ Edge-LLM ซึ่งให้อุปกรณ์ปลายทางทำงานร่วมกับคลาวด์ พร้อม adaptive quantization การแคช และการจัดลำดับงาน ผลการศึกษาช่วยชี้ว่าการจัดการภาระงานเป็นส่วนของการออกแบบ edge inference แต่แนวทาง hybrid ไม่ตรงกับเป้าหมายการประมวลผลหลักในบ้านของโครงงานนี้ จึงใช้เป็นจุดเปรียบเทียบเชิงสถาปัตยกรรม มิใช่วิธีที่นำมาติดตั้งตรงตัว [18]</w:t>
+      </w:r>
+    </w:p>
+    <w:p>
+      <w:pPr>
+        <w:keepLines/>
+      </w:pPr>
+      <w:r>
+        <w:rPr>
+          <w:rFonts w:ascii="TH Sarabun New" w:hAnsi="TH Sarabun New" w:eastAsia="TH Sarabun New" w:cs="TH Sarabun New"/>
+        </w:rPr>
+        <w:t>Husom และคณะประเมิน quantized LLM หลายแบบบน Raspberry Pi 4 โดยวัดความถูกต้อง ความหน่วง และพลังงานด้วยเครื่องมือวัดภายนอก งานนี้ให้แนวทางบันทึกคุณภาพผลลัพธ์คู่กับต้นทุนการประมวลผล โครงงานจะนำแนวคิดการวัดแบบจับคู่มาใช้กับงานสกัดฟิลด์จริง แต่ไม่ใช้ผลความแม่นยำจากชุดทดสอบเดิมแทนความแม่นยำของชื่อสินค้าภาษาไทย [1]</w:t>
+      </w:r>
+    </w:p>
+    <w:p>
+      <w:pPr>
+        <w:keepLines/>
+      </w:pPr>
+      <w:r>
+        <w:rPr>
+          <w:rFonts w:ascii="TH Sarabun New" w:hAnsi="TH Sarabun New" w:eastAsia="TH Sarabun New" w:cs="TH Sarabun New"/>
+        </w:rPr>
+        <w:t>Moon และคณะเสนอระบบ Hybe ที่ประสาน GPU กับ NPU สำหรับบริบทยาวมาก งานนี้แสดงผลของการแบ่งงานระหว่างขั้น prefill และ decode แต่ทดลองบนฮาร์ดแวร์ที่ต่างจากบอร์ดเป้าหมายอย่างมาก โครงงานจึงใช้เป็นกรณีเปรียบเทียบขอบเขตฮาร์ดแวร์ ไม่ตั้งสมมติฐานว่าความเร็วจากงานดังกล่าวจะเกิดซ้ำบน RK3588 [19]</w:t>
+      </w:r>
+    </w:p>
+    <w:p>
+      <w:pPr>
+        <w:keepLines/>
+      </w:pPr>
+      <w:r>
+        <w:rPr>
+          <w:rFonts w:ascii="TH Sarabun New" w:hAnsi="TH Sarabun New" w:eastAsia="TH Sarabun New" w:cs="TH Sarabun New"/>
+        </w:rPr>
+        <w:t>Yin และคณะพัฒนา ShadowNPU ที่เน้น NPU และแบ่งการคำนวณตามความไวของส่วนต่าง ๆ ต่อความละเอียดเชิงตัวเลข แนวคิดนี้ช่วยตั้งคำถามว่าการบีบอัดทั้งโมเดลให้เท่ากันเหมาะสมหรือไม่ อย่างไรก็ตาม การทดลองอยู่บนอุปกรณ์และ runtime คนละชนิด ระยะแรกของโครงงานจะตรวจความเข้ากันได้และผลรวมของโมเดลก่อนพิจารณาการแบ่งเลเยอร์ขั้นสูง [17]</w:t>
+      </w:r>
+    </w:p>
+    <w:p>
+      <w:pPr>
+        <w:keepLines/>
+      </w:pPr>
+      <w:r>
+        <w:rPr>
+          <w:rFonts w:ascii="TH Sarabun New" w:hAnsi="TH Sarabun New" w:eastAsia="TH Sarabun New" w:cs="TH Sarabun New"/>
+        </w:rPr>
+        <w:t>Oloko-Oba และคณะทบทวน edge machine learning สำหรับอุปกรณ์สวมใส่ทางการแพทย์ และชี้ปัญหาคุณภาพข้อมูลภาคสนามกับการรับส่งข้อมูลออกนอกอุปกรณ์ แม้ไม่ใช่งานเอกสารซื้อสินค้า รายงานเดิมใช้เพื่อสนับสนุนหลักการออกแบบที่ให้ข้อมูลอยู่ใกล้แหล่งกำเนิดและต้องตรวจความน่าเชื่อถือของข้อมูลจริง ไม่ใช่หลักฐานว่าระบบบ้านของโครงงานให้ผลเท่ากับระบบการแพทย์ [20]</w:t>
+      </w:r>
+    </w:p>
+    <w:p>
+      <w:pPr>
+        <w:keepLines/>
+      </w:pPr>
+      <w:r>
+        <w:rPr>
+          <w:rFonts w:ascii="TH Sarabun New" w:hAnsi="TH Sarabun New" w:eastAsia="TH Sarabun New" w:cs="TH Sarabun New"/>
+        </w:rPr>
+        <w:t>Zheng และคณะสำรวจการออกแบบและรัน edge LLM ตั้งแต่การลดขนาดโมเดลถึงการใช้ฮาร์ดแวร์ต่างระดับ งานสำรวจช่วยจัดหมวดตัวเลือกของ runtime และข้อจำกัดหน่วยความจำ แต่ไม่ได้ให้คะแนนทดลองสำหรับใบซื้อสินค้า โครงงานใช้เป็นกรอบเลือกแบบจำลองและบันทึกเหตุผลที่ตัดตัวเลือกซึ่งไม่เหมาะกับเครื่อง [21]</w:t>
+      </w:r>
+    </w:p>
+    <w:p>
+      <w:pPr>
+        <w:keepLines/>
+      </w:pPr>
+      <w:r>
+        <w:rPr>
+          <w:rFonts w:ascii="TH Sarabun New" w:hAnsi="TH Sarabun New" w:eastAsia="TH Sarabun New" w:cs="TH Sarabun New"/>
+        </w:rPr>
+        <w:t>Giedra และคณะเปรียบเทียบแบบจำลองที่บีบอัดหลายขนาดบนอุปกรณ์ edge โดยรายงานความแม่นยำ ความเร็ว และพลังงานร่วมกัน การใช้ชุดค่าคอนฟิกที่ระบุชัดเจนมีประโยชน์ต่อการออกแบบตารางทดลองของโครงงาน แต่ชุดทดสอบทั่วไปของบทความไม่ทดสอบ JSON จากใบเสร็จ จึงต้องเพิ่มเกณฑ์ความถูกต้องของโครงสร้างและค่าฟิลด์ที่เฉพาะกับงานนี้ [2]</w:t>
+      </w:r>
+    </w:p>
+    <w:p>
+      <w:pPr>
+        <w:keepLines/>
+      </w:pPr>
+      <w:r>
+        <w:rPr>
+          <w:rFonts w:ascii="TH Sarabun New" w:hAnsi="TH Sarabun New" w:eastAsia="TH Sarabun New" w:cs="TH Sarabun New"/>
+        </w:rPr>
+        <w:t>Zheng และคณะเสนอ SGLang สำหรับโปรแกรมภาษาแบบมีโครงสร้าง และใช้การจัดการแคชกับการถอดรหัสที่รู้ข้อจำกัดของรูปแบบ ข้อค้นพบเป็นแรงจูงใจให้ทดลอง grammar-constrained output เพราะคีย์ของ JSON หลายช่องคงที่ อย่างไรก็ตาม ความเร็วในบทความมาจากระบบและฮาร์ดแวร์อีกระดับ จึงต้องวัด runtime ที่ใช้งานจริงแยกต่างหาก [3]</w:t>
+      </w:r>
+    </w:p>
+    <w:p>
+      <w:pPr>
+        <w:keepLines/>
+      </w:pPr>
+      <w:r>
+        <w:rPr>
+          <w:rFonts w:ascii="TH Sarabun New" w:hAnsi="TH Sarabun New" w:eastAsia="TH Sarabun New" w:cs="TH Sarabun New"/>
+        </w:rPr>
+        <w:t>Hu และคณะเสนอ mPLUG-DocOwl2 สำหรับความเข้าใจเอกสารหลายหน้าแบบ OCR-free ด้วยการบีบอัด visual token งานนี้เป็นแนวทางทางเลือกต่อ pipeline ที่แยก YOLO และ OCR แต่ขนาดงานและทรัพยากรต่างจากกรณีใบซื้อสินค้าบนเครื่องจำกัด โครงงานจะบันทึกข้อดีข้อเสียของแนวทาง OCR-free ในการอภิปราย โดยไม่เพิ่มเป็นตัวแปรหลักก่อนพิสูจน์ baseline ที่วางไว้ [22]</w:t>
+      </w:r>
+    </w:p>
+    <w:p>
+      <w:pPr>
+        <w:keepLines/>
+      </w:pPr>
+      <w:r>
+        <w:rPr>
+          <w:rFonts w:ascii="TH Sarabun New" w:hAnsi="TH Sarabun New" w:eastAsia="TH Sarabun New" w:cs="TH Sarabun New"/>
+        </w:rPr>
+        <w:t>Rivkin และคณะศึกษาตัวแทน LLM สำหรับสั่งงานบ้านอัจฉริยะ โดยวัดการทำงานสำเร็จของคำสั่ง องค์ประกอบการเชื่อมข้อมูลกับระบบบ้านเกี่ยวข้องกับชั้นประยุกต์ใช้ของโครงงาน แต่การสั่งอุปกรณ์ไม่เท่ากับการสกัดชื่อสินค้าและราคา จึงต้องวัดความถูกต้องต้นทางก่อนส่งข้อความไปยัง Home Assistant [14]</w:t>
+      </w:r>
+    </w:p>
+    <w:p>
+      <w:pPr>
+        <w:keepLines/>
+      </w:pPr>
+      <w:r>
+        <w:rPr>
+          <w:rFonts w:ascii="TH Sarabun New" w:hAnsi="TH Sarabun New" w:eastAsia="TH Sarabun New" w:cs="TH Sarabun New"/>
+        </w:rPr>
+        <w:t>Sawalha และ Al-Naymat เสนอ Adaptive Holt-Winters สำหรับข้อมูล IoT ตามเวลา วิธีดังกล่าวเป็นฐานของการพยากรณ์ปลายน้ำตามรายงานเดิม แต่ใบเสร็จแสดงการซื้อเข้าเท่านั้น การประเมินอัตราการใช้จะทำได้เมื่อมีปริมาณคงเหลือหรือเหตุการณ์การใช้ตามช่วงเวลาที่เพียงพอและตรวจความถูกต้องแล้ว [15]</w:t>
+      </w:r>
+    </w:p>
+    <w:p>
+      <w:pPr>
+        <w:keepLines/>
+      </w:pPr>
+      <w:r>
+        <w:rPr>
+          <w:rFonts w:ascii="TH Sarabun New" w:hAnsi="TH Sarabun New" w:eastAsia="TH Sarabun New" w:cs="TH Sarabun New"/>
+        </w:rPr>
+        <w:t>Serepas และคณะออกแบบเกตเวย์ ESP32 สำหรับบ้านอัจฉริยะที่รองรับ MQTT และ REST API งานนี้ช่วยกำหนดจุดเชื่อมข้อมูลระหว่างเครื่องประมวลผลกับระบบบ้าน แต่การมีเกตเวย์ที่ส่งข้อความสำเร็จไม่ได้ยืนยันความถูกต้องของ JSON ที่ส่ง โครงงานจะแยกตัววัดการส่งข้อความออกจากตัววัดเนื้อหาสินค้า [16]</w:t>
+      </w:r>
+    </w:p>
+    <w:p>
+      <w:pPr>
+        <w:pStyle w:val="Heading2"/>
+        <w:keepNext/>
+        <w:keepLines/>
+        <w:ind w:left="360"/>
+      </w:pPr>
+      <w:r>
+        <w:rPr>
+          <w:rFonts w:ascii="TH Sarabun New" w:hAnsi="TH Sarabun New" w:eastAsia="TH Sarabun New" w:cs="TH Sarabun New"/>
+        </w:rPr>
+        <w:t>4.7  ข้อสอดคล้อง ข้อแตกต่าง และข้อจำกัดการถ่ายโอนผล</w:t>
+      </w:r>
+    </w:p>
+    <w:p>
+      <w:pPr>
+        <w:keepLines/>
+      </w:pPr>
+      <w:r>
+        <w:rPr>
+          <w:rFonts w:ascii="TH Sarabun New" w:hAnsi="TH Sarabun New" w:eastAsia="TH Sarabun New" w:cs="TH Sarabun New"/>
+        </w:rPr>
+        <w:t>งานกลุ่ม quantization เห็นร่วมกันว่าการใช้ทรัพยากรลดลงต้องพิจารณาคู่กับคุณภาพผลลัพธ์ ไม่ควรเลือกระดับบีบอัดจากขนาดไฟล์อย่างเดียว [1, 2, 17–19] อย่างไรก็ตาม ผลของแต่ละงานมาจาก Raspberry Pi, Jetson, สมาร์ตโฟน หรือระบบระดับศูนย์ข้อมูล ซึ่งมีหน่วยความจำ ตัวเร่ง และ runtime ต่างกัน ดังนั้นผลเวลาและพลังงานไม่สามารถแทนค่าบนบอร์ดที่โครงงานจะใช้ในอนาคตได้ [12]</w:t>
+      </w:r>
+    </w:p>
+    <w:p>
+      <w:pPr>
+        <w:keepLines/>
+      </w:pPr>
+      <w:r>
+        <w:rPr>
+          <w:rFonts w:ascii="TH Sarabun New" w:hAnsi="TH Sarabun New" w:eastAsia="TH Sarabun New" w:cs="TH Sarabun New"/>
+        </w:rPr>
+        <w:t>งานด้าน structured output และความเข้าใจเอกสารมีจุดต่างในระดับวิธีรับข้อมูล SGLang เน้นขั้นสร้างข้อความที่มีโครงสร้างหลังมีอินพุตข้อความแล้ว ส่วน mPLUG-DocOwl2 พยายามทำความเข้าใจเอกสารจากภาพโดยตรง [3, 22] สถาปัตยกรรมเดิมเลือก YOLO→OCR→LLM เพื่อให้ตรวจข้อผิดพลาดรายชั้นได้ การเลือกนี้ต้องพิสูจน์ด้วยผลจริง เพราะการแยกชั้นอาจเพิ่มเวลาและส่งต่อความผิดพลาดจาก OCR ได้ [12]</w:t>
+      </w:r>
+    </w:p>
+    <w:p>
+      <w:pPr>
+        <w:keepLines/>
+      </w:pPr>
+      <w:r>
+        <w:rPr>
+          <w:rFonts w:ascii="TH Sarabun New" w:hAnsi="TH Sarabun New" w:eastAsia="TH Sarabun New" w:cs="TH Sarabun New"/>
+        </w:rPr>
+        <w:t>งานบ้านอัจฉริยะวัดความสำเร็จคนละปลายทาง: Rivkin วัดการควบคุมอุปกรณ์, Serepas วัดการเชื่อมต่อเกตเวย์ และ Sawalha วัดการพยากรณ์อนุกรมเวลา [14–16] ไม่มีตัววัดใดแทนความถูกต้องของการอ่านใบซื้อสินค้าต้นทางได้ จึงต้องกำหนด provenance และสถานะตรวจสอบของแต่ละรายการก่อนส่งต่อ ผลสังเคราะห์นี้จำกัดเฉพาะ 12 บทความที่คัดในรายงานเดิม [12]</w:t>
+      </w:r>
+    </w:p>
+    <w:p>
+      <w:pPr>
+        <w:pStyle w:val="Heading2"/>
+        <w:keepNext/>
+        <w:keepLines/>
+        <w:ind w:left="360"/>
+      </w:pPr>
+      <w:r>
+        <w:rPr>
+          <w:rFonts w:ascii="TH Sarabun New" w:hAnsi="TH Sarabun New" w:eastAsia="TH Sarabun New" w:cs="TH Sarabun New"/>
+        </w:rPr>
+        <w:t>4.8  ช่องว่างวิจัยและผลต่อการออกแบบการทดลอง</w:t>
+      </w:r>
+    </w:p>
+    <w:p>
+      <w:pPr>
+        <w:keepLines/>
+      </w:pPr>
+      <w:r>
+        <w:rPr>
+          <w:rFonts w:ascii="TH Sarabun New" w:hAnsi="TH Sarabun New" w:eastAsia="TH Sarabun New" w:cs="TH Sarabun New"/>
+        </w:rPr>
+        <w:t>ช่องว่างจากชุดวรรณกรรมที่ทบทวนคือการขาดผลวัดร่วมกันของการตรวจเอกสาร การอ่านข้อความ การสร้าง JSON และการใช้งานปลายน้ำภายใต้ข้อจำกัดทรัพยากรเดียวกันในบริบทใบซื้อสินค้าไทย/อังกฤษ [12] ข้อความนี้เป็นข้อสรุปภายในชุดวรรณกรรมที่คัด ไม่ใช่การยืนยันว่าไม่มีงานวิจัยอื่นในโลกศึกษาเรื่องดังกล่าว</w:t>
+      </w:r>
+    </w:p>
+    <w:p>
+      <w:pPr>
+        <w:keepLines/>
+      </w:pPr>
+      <w:r>
+        <w:rPr>
+          <w:rFonts w:ascii="TH Sarabun New" w:hAnsi="TH Sarabun New" w:eastAsia="TH Sarabun New" w:cs="TH Sarabun New"/>
+        </w:rPr>
+        <w:t>จึงกำหนดหน่วยวิเคราะห์เป็นธุรกรรมที่ตรวจความซ้ำแล้ว เปรียบเทียบผลแบบมีเฉลยของแต่ละชั้น และใช้ข้อมูลเดียวกันกับทุกค่าคอนฟิกของโมเดล การรายงานจะแยกกรณีข้อความ OCR จากภาพจริงกับข้อความเฉลยที่ป้อนให้โมเดลภาษา เพื่อเห็นความผิดพลาดที่เกิดในขั้นภาพ/ข้อความและขั้นสร้าง JSON ตามลำดับ การวัดเวลารายชั้นพร้อม end-to-end ทำให้ระบุต้นทุนของขั้นที่เพิ่มขึ้นได้</w:t>
+      </w:r>
+    </w:p>
+    <w:p>
+      <w:pPr>
+        <w:keepLines/>
+      </w:pPr>
+      <w:r>
+        <w:rPr>
+          <w:rFonts w:ascii="TH Sarabun New" w:hAnsi="TH Sarabun New" w:eastAsia="TH Sarabun New" w:cs="TH Sarabun New"/>
+        </w:rPr>
+        <w:t>ชั้นปลายน้ำจะทดสอบการรับข้อความที่ผ่านการตรวจแล้วโดยใช้ข้อมูลจำลองและบันทึกผลการรับส่งแยกจากความถูกต้องของรายการสินค้า ส่วนการพยากรณ์อัตราการใช้ไม่อยู่ในผลนำร่องจนกว่าจะมีข้อมูลคงเหลือหรือการใช้ตามเวลาเพียงพอ ขอบเขตนี้รักษาแนวคิด Home Assistant และ Adaptive Holt-Winters จากรายงานเดิม พร้อมหลีกเลี่ยงการสรุปเกินข้อมูลที่มี [12, 15, 16]</w:t>
+      </w:r>
+    </w:p>
+    <w:p>
+      <w:pPr>
         <w:pStyle w:val="Heading1"/>
         <w:keepNext/>
-        <w:keepLines w:val="0"/>
+        <w:keepLines/>
       </w:pPr>
       <w:r>
         <w:rPr>
@@ -784,7 +1035,7 @@
       <w:pPr>
         <w:pStyle w:val="Heading2"/>
         <w:keepNext/>
-        <w:keepLines w:val="0"/>
+        <w:keepLines/>
         <w:ind w:left="360"/>
       </w:pPr>
       <w:r>
@@ -796,7 +1047,7 @@
     </w:p>
     <w:p>
       <w:pPr>
-        <w:keepLines w:val="0"/>
+        <w:keepLines/>
       </w:pPr>
       <w:r>
         <w:rPr>
@@ -868,7 +1119,7 @@
     </w:p>
     <w:p>
       <w:pPr>
-        <w:keepLines w:val="0"/>
+        <w:keepLines/>
       </w:pPr>
       <w:r>
         <w:rPr>
@@ -880,6 +1131,7 @@
     <w:p>
       <w:pPr>
         <w:keepNext/>
+        <w:pageBreakBefore/>
         <w:spacing w:before="180" w:after="280"/>
       </w:pPr>
       <w:r>
@@ -1416,7 +1668,7 @@
       <w:pPr>
         <w:pStyle w:val="Heading2"/>
         <w:keepNext/>
-        <w:keepLines w:val="0"/>
+        <w:keepLines/>
         <w:ind w:left="360"/>
       </w:pPr>
       <w:r>
@@ -1428,7 +1680,7 @@
     </w:p>
     <w:p>
       <w:pPr>
-        <w:keepLines w:val="0"/>
+        <w:keepLines/>
       </w:pPr>
       <w:r>
         <w:rPr>
@@ -1439,7 +1691,7 @@
     </w:p>
     <w:p>
       <w:pPr>
-        <w:keepLines w:val="0"/>
+        <w:keepLines/>
       </w:pPr>
       <w:r>
         <w:rPr>
@@ -1450,7 +1702,7 @@
     </w:p>
     <w:p>
       <w:pPr>
-        <w:keepLines w:val="0"/>
+        <w:keepLines/>
       </w:pPr>
       <w:r>
         <w:rPr>
@@ -1463,7 +1715,7 @@
       <w:pPr>
         <w:pStyle w:val="Heading2"/>
         <w:keepNext/>
-        <w:keepLines w:val="0"/>
+        <w:keepLines/>
         <w:ind w:left="360"/>
       </w:pPr>
       <w:r>
@@ -1475,7 +1727,7 @@
     </w:p>
     <w:p>
       <w:pPr>
-        <w:keepLines w:val="0"/>
+        <w:keepLines/>
       </w:pPr>
       <w:r>
         <w:rPr>
@@ -1486,7 +1738,7 @@
     </w:p>
     <w:p>
       <w:pPr>
-        <w:keepLines w:val="0"/>
+        <w:keepLines/>
       </w:pPr>
       <w:r>
         <w:rPr>
@@ -1954,7 +2206,7 @@
       <w:pPr>
         <w:pStyle w:val="Heading2"/>
         <w:keepNext/>
-        <w:keepLines w:val="0"/>
+        <w:keepLines/>
         <w:ind w:left="360"/>
       </w:pPr>
       <w:r>
@@ -1966,7 +2218,7 @@
     </w:p>
     <w:p>
       <w:pPr>
-        <w:keepLines w:val="0"/>
+        <w:keepLines/>
       </w:pPr>
       <w:r>
         <w:rPr>
@@ -1977,7 +2229,7 @@
     </w:p>
     <w:p>
       <w:pPr>
-        <w:keepLines w:val="0"/>
+        <w:keepLines/>
       </w:pPr>
       <w:r>
         <w:rPr>
@@ -1990,7 +2242,7 @@
       <w:pPr>
         <w:pStyle w:val="Heading2"/>
         <w:keepNext/>
-        <w:keepLines w:val="0"/>
+        <w:keepLines/>
         <w:ind w:left="360"/>
       </w:pPr>
       <w:r>
@@ -2002,18 +2254,18 @@
     </w:p>
     <w:p>
       <w:pPr>
-        <w:keepLines w:val="0"/>
+        <w:keepLines/>
       </w:pPr>
       <w:r>
         <w:rPr>
           <w:rFonts w:ascii="TH Sarabun New" w:hAnsi="TH Sarabun New" w:eastAsia="TH Sarabun New" w:cs="TH Sarabun New"/>
         </w:rPr>
-        <w:t>เมื่อ JSON ผ่านการตรวจแล้วจึงทดสอบส่งข้อความจำลองผ่าน MQTT ไปยังระบบบ้านอัจฉริยะ โดยแยกคะแนนความถูกต้องของข้อมูลต้นทางออกจากการส่งข้อความ ตามฐาน Assignment 4 จะพิจารณา dashboard และวิธีพยากรณ์อนุกรมเวลา เช่น Adaptive Holt-Winters เมื่อมีข้อมูลปริมาณคงเหลือหรือการใช้จริงหลายช่วงเวลา ใบเสร็จบอกเพียงการซื้อเข้า จึงยังไม่อ้างผล burn rate จากชุดปัจจุบัน [12, 15, 16]</w:t>
+        <w:t>เมื่อ JSON ผ่านการตรวจแล้วจึงทดสอบส่งข้อความจำลองผ่าน MQTT ไปยังระบบบ้านอัจฉริยะ โดยแยกคะแนนความถูกต้องของข้อมูลต้นทางออกจากการส่งข้อความ ตามฐานรายงานทบทวนวรรณกรรมเดิมจะพิจารณา dashboard และวิธีพยากรณ์อนุกรมเวลา เช่น Adaptive Holt-Winters เมื่อมีข้อมูลปริมาณคงเหลือหรือการใช้จริงหลายช่วงเวลา ใบเสร็จบอกเพียงการซื้อเข้า จึงยังไม่อ้างผล burn rate จากชุดปัจจุบัน [12, 15, 16]</w:t>
       </w:r>
     </w:p>
     <w:p>
       <w:pPr>
-        <w:keepLines w:val="0"/>
+        <w:keepLines/>
       </w:pPr>
       <w:r>
         <w:rPr>
@@ -2024,9 +2276,128 @@
     </w:p>
     <w:p>
       <w:pPr>
+        <w:pStyle w:val="Heading2"/>
+        <w:keepNext/>
+        <w:keepLines/>
+        <w:ind w:left="360"/>
+      </w:pPr>
+      <w:r>
+        <w:rPr>
+          <w:rFonts w:ascii="TH Sarabun New" w:hAnsi="TH Sarabun New" w:eastAsia="TH Sarabun New" w:cs="TH Sarabun New"/>
+        </w:rPr>
+        <w:t>5.6  การไหลของข้อมูลและจุดตรวจสอบแต่ละชั้น</w:t>
+      </w:r>
+    </w:p>
+    <w:p>
+      <w:pPr>
+        <w:keepLines/>
+      </w:pPr>
+      <w:r>
+        <w:rPr>
+          <w:rFonts w:ascii="TH Sarabun New" w:hAnsi="TH Sarabun New" w:eastAsia="TH Sarabun New" w:cs="TH Sarabun New"/>
+        </w:rPr>
+        <w:t>ข้อมูลนำเข้าหนึ่งหน่วยเป็นภาพที่ผูกกับรหัสธุรกรรม เมื่อระบบตรวจพบกรอบเอกสารจะบันทึกพิกัด คะแนนความเชื่อมั่น และเวอร์ชันโมเดลก่อน crop ภาพเข้าสู่ OCR ข้อความที่ได้จะเก็บทั้งรูปดิบและรูปที่ผ่านการจัดรูปแบบ โดยไม่เขียนทับต้นฉบับ ขั้นสกัด JSON จะอ้างรหัสภาพและบริเวณข้อความที่ใช้ยืนยันค่าฟิลด์ การบันทึกดังกล่าวทำให้ตรวจย้อนจากรายการสินค้ากลับไปยังภาพได้และแยกจุดผิดพลาดของแต่ละชั้น</w:t>
+      </w:r>
+    </w:p>
+    <w:p>
+      <w:pPr>
+        <w:keepLines/>
+      </w:pPr>
+      <w:r>
+        <w:rPr>
+          <w:rFonts w:ascii="TH Sarabun New" w:hAnsi="TH Sarabun New" w:eastAsia="TH Sarabun New" w:cs="TH Sarabun New"/>
+        </w:rPr>
+        <w:t>ก่อนส่งข้อมูลไป MQTT จะตรวจว่า JSON parse ได้ ตรง schema และผ่านกฎพื้นฐาน เช่น ยอดรวมเป็นตัวเลขที่อนุญาตและรายการมีชื่อหรือสถานะอ่านไม่ออก สำหรับฟิลด์ที่ไม่มีหลักฐานจะใช้ null หรือสถานะรอตรวจ ไม่ใช้โมเดลเติมค่าด้วยการเดา ข้อความที่ส่งออกจะมีรหัสธุรกรรม เวลาประมวลผล และสถานะยืนยันเพื่อไม่ให้ dashboard ตีความรายการที่ยังไม่ตรวจเป็นข้อมูลจริง</w:t>
+      </w:r>
+    </w:p>
+    <w:p>
+      <w:pPr>
+        <w:keepLines/>
+      </w:pPr>
+      <w:r>
+        <w:rPr>
+          <w:rFonts w:ascii="TH Sarabun New" w:hAnsi="TH Sarabun New" w:eastAsia="TH Sarabun New" w:cs="TH Sarabun New"/>
+        </w:rPr>
+        <w:t>การทดลองจะบันทึกจำนวนรายการที่ตกหล่นในแต่ละจุด ได้แก่ ภาพที่หากรอบไม่พบ ข้อความที่ OCR อ่านไม่ได้ JSON ที่ parse หรือ schema ไม่ผ่าน และฟิลด์ที่ผ่านรูปแบบแต่ค่าผิดจากเฉลย ผล end-to-end จะนับความสำเร็จจากภาพต้นทางถึงรายการ JSON ที่ตรวจตรงเฉลย ไม่ใช้ค่า mAP ของตัวตรวจจับแทนคุณภาพปลายทาง</w:t>
+      </w:r>
+    </w:p>
+    <w:p>
+      <w:pPr>
+        <w:pStyle w:val="Heading2"/>
+        <w:keepNext/>
+        <w:keepLines/>
+        <w:ind w:left="360"/>
+      </w:pPr>
+      <w:r>
+        <w:rPr>
+          <w:rFonts w:ascii="TH Sarabun New" w:hAnsi="TH Sarabun New" w:eastAsia="TH Sarabun New" w:cs="TH Sarabun New"/>
+        </w:rPr>
+        <w:t>5.7  การเปรียบเทียบแบบจำลองและความเที่ยงตรงของผล</w:t>
+      </w:r>
+    </w:p>
+    <w:p>
+      <w:pPr>
+        <w:keepLines/>
+      </w:pPr>
+      <w:r>
+        <w:rPr>
+          <w:rFonts w:ascii="TH Sarabun New" w:hAnsi="TH Sarabun New" w:eastAsia="TH Sarabun New" w:cs="TH Sarabun New"/>
+        </w:rPr>
+        <w:t>การเปรียบเทียบระดับ quantization จะตรึงภาพ ชุดฝึก/ตรวจ เฉลย prompt และ schema ไว้เหมือนกันทุกเงื่อนไข เริ่มด้วย baseline ที่ไม่บังคับรูปแบบ แล้วเปิด grammar ใน runtime เดียวกันเพื่อแยกผลของข้อจำกัดโครงสร้าง จากนั้นจึงเปรียบเทียบขนาดหรือระดับบีบอัดภายใต้ขีดจำกัดหน่วยความจำเดียวกัน หาก runtime ใดไม่รองรับ grammar หรือโมเดลที่เลือก จะบันทึกว่าเป็นเงื่อนไขที่ทดสอบไม่ได้ แทนการเติมคะแนนประมาณ [1–3, 5]</w:t>
+      </w:r>
+    </w:p>
+    <w:p>
+      <w:pPr>
+        <w:keepLines/>
+      </w:pPr>
+      <w:r>
+        <w:rPr>
+          <w:rFonts w:ascii="TH Sarabun New" w:hAnsi="TH Sarabun New" w:eastAsia="TH Sarabun New" w:cs="TH Sarabun New"/>
+        </w:rPr>
+        <w:t>การวัดทรัพยากรบน PC จะเก็บสภาพแวดล้อม รุ่น CPU/RAM เวอร์ชันไลบรารี จำนวน thread และเวลา warm-up ก่อนจับเวลาหลายรอบต่อเงื่อนไข รายงานค่ามัธยฐานและการกระจายของ latency แยกการโหลดโมเดลออกจากเวลาประมวลผลต่อภาพ ส่วนพลังงานจะรายงานเฉพาะเมื่อมีเครื่องมือวัดที่ระบุวิธีสอบเทียบได้ ไม่ใช้ค่า TDP หรือเวลาคูณกำลังไฟสมมติเป็นพลังงานที่วัดจริง [1, 2]</w:t>
+      </w:r>
+    </w:p>
+    <w:p>
+      <w:pPr>
+        <w:keepLines/>
+      </w:pPr>
+      <w:r>
+        <w:rPr>
+          <w:rFonts w:ascii="TH Sarabun New" w:hAnsi="TH Sarabun New" w:eastAsia="TH Sarabun New" w:cs="TH Sarabun New"/>
+        </w:rPr>
+        <w:t>ความเสี่ยงต่อความเที่ยงตรงของผลรวมถึงภาพใกล้ซ้ำระหว่างชุดฝึกกับชุดทดสอบ ความต่างของฉากและทิศตัวหนังสือ ชื่อสินค้าที่อ่านไม่ครบ และเฉลยที่ยังไม่มีผู้ตรวจคนที่สอง จึงต้องจัดกลุ่มธุรกรรมก่อนแบ่งข้อมูล เก็บกลุ่มฉากใหม่ไว้ต่างหาก ตรวจเฉลยสองรอบ และรายงานจำนวนตัวอย่างของทุกคะแนน ผลนำร่องปัจจุบันใช้เพื่อเลือกประเด็นทดลองต่อ ไม่ใช้ยืนยันสมรรถนะทั่วไปของระบบ</w:t>
+      </w:r>
+    </w:p>
+    <w:p>
+      <w:pPr>
+        <w:pStyle w:val="Heading2"/>
+        <w:keepNext/>
+        <w:keepLines/>
+        <w:ind w:left="360"/>
+      </w:pPr>
+      <w:r>
+        <w:rPr>
+          <w:rFonts w:ascii="TH Sarabun New" w:hAnsi="TH Sarabun New" w:eastAsia="TH Sarabun New" w:cs="TH Sarabun New"/>
+        </w:rPr>
+        <w:t>5.8  ลำดับส่งมอบตามสถาปัตยกรรมเดิม</w:t>
+      </w:r>
+    </w:p>
+    <w:p>
+      <w:pPr>
+        <w:keepLines/>
+      </w:pPr>
+      <w:r>
+        <w:rPr>
+          <w:rFonts w:ascii="TH Sarabun New" w:hAnsi="TH Sarabun New" w:eastAsia="TH Sarabun New" w:cs="TH Sarabun New"/>
+        </w:rPr>
+        <w:t>ผลส่งมอบระยะแรกคือชุดข้อมูลที่ตรวจชนิดและธุรกรรมซ้ำ คู่มือทำเฉลย และ baseline ของ YOLO/OCR บน PC ระยะที่สองคือการสกัด JSON และตารางผลเปรียบเทียบ schema/ค่าฟิลด์/ทรัพยากร ระยะที่สามคือการตรวจข้อความ MQTT และ dashboard ด้วยข้อมูลที่ผ่านการตรวจ ก่อนพิจารณาข้อมูลคงเหลือเพื่อประเมินอัตราการใช้ หากได้รับบอร์ดและ runtime ที่เข้ากันได้ จะเพิ่มผลวัดอุปกรณ์จริงเป็นระยะถัดไป แผนนี้สืบจาก roadmap เจ็ดระยะในรายงานเดิมแต่ปรับสถานะตามหลักฐานปัจจุบัน [12]</w:t>
+      </w:r>
+    </w:p>
+    <w:p>
+      <w:pPr>
         <w:pStyle w:val="Heading1"/>
         <w:keepNext/>
-        <w:keepLines w:val="0"/>
+        <w:keepLines/>
       </w:pPr>
       <w:r>
         <w:rPr>
@@ -2037,7 +2408,7 @@
     </w:p>
     <w:p>
       <w:pPr>
-        <w:keepLines w:val="0"/>
+        <w:keepLines/>
       </w:pPr>
       <w:r>
         <w:rPr>
@@ -2048,7 +2419,7 @@
     </w:p>
     <w:p>
       <w:pPr>
-        <w:keepLines w:val="0"/>
+        <w:keepLines/>
       </w:pPr>
       <w:r>
         <w:rPr>
@@ -2061,7 +2432,7 @@
       <w:pPr>
         <w:pStyle w:val="Heading1"/>
         <w:keepNext/>
-        <w:keepLines w:val="0"/>
+        <w:keepLines/>
       </w:pPr>
       <w:r>
         <w:rPr>
@@ -2072,7 +2443,7 @@
     </w:p>
     <w:p>
       <w:pPr>
-        <w:keepLines w:val="0"/>
+        <w:keepLines/>
       </w:pPr>
       <w:r>
         <w:rPr>
@@ -2085,7 +2456,7 @@
       <w:pPr>
         <w:pStyle w:val="Heading1"/>
         <w:keepNext/>
-        <w:keepLines w:val="0"/>
+        <w:keepLines/>
       </w:pPr>
       <w:r>
         <w:rPr>
@@ -2096,7 +2467,7 @@
     </w:p>
     <w:p>
       <w:pPr>
-        <w:keepLines w:val="0"/>
+        <w:keepLines/>
         <w:ind w:left="360" w:hanging="259"/>
       </w:pPr>
       <w:r>
@@ -2108,7 +2479,7 @@
     </w:p>
     <w:p>
       <w:pPr>
-        <w:keepLines w:val="0"/>
+        <w:keepLines/>
         <w:ind w:left="360" w:hanging="259"/>
       </w:pPr>
       <w:r>
@@ -2120,7 +2491,7 @@
     </w:p>
     <w:p>
       <w:pPr>
-        <w:keepLines w:val="0"/>
+        <w:keepLines/>
         <w:ind w:left="360" w:hanging="259"/>
       </w:pPr>
       <w:r>
@@ -2132,7 +2503,7 @@
     </w:p>
     <w:p>
       <w:pPr>
-        <w:keepLines w:val="0"/>
+        <w:keepLines/>
         <w:ind w:left="360" w:hanging="259"/>
       </w:pPr>
       <w:r>
@@ -2146,7 +2517,8 @@
       <w:pPr>
         <w:pStyle w:val="Heading1"/>
         <w:keepNext/>
-        <w:keepLines w:val="0"/>
+        <w:keepLines/>
+        <w:pageBreakBefore/>
       </w:pPr>
       <w:r>
         <w:rPr>
@@ -2157,13 +2529,13 @@
     </w:p>
     <w:p>
       <w:pPr>
-        <w:keepLines w:val="0"/>
+        <w:keepLines/>
       </w:pPr>
       <w:r>
         <w:rPr>
           <w:rFonts w:ascii="TH Sarabun New" w:hAnsi="TH Sarabun New" w:eastAsia="TH Sarabun New" w:cs="TH Sarabun New"/>
         </w:rPr>
-        <w:t>Implementation Roadmap เจ็ดระยะใน Assignment 4 ยังเป็นแผนแม่บท: (1) ทบทวนวรรณกรรมและสถาปัตยกรรมเสร็จแล้ว (2) ต้นแบบ YOLO/OCR เริ่มนำร่องบน PC (3) Local LLM และ JSON (4) MQTT/Home Assistant และการวิเคราะห์ปลายน้ำ (5) เก็บและประเมินข้อมูลนำร่อง (6) จริยธรรมสำหรับการศึกษากับผู้ใช้เมื่อเกี่ยวข้อง และ (7) ประเมิน trade-off แบบครบระบบ [12] ตารางต่อไปแตกงานระยะ PC ที่ทำได้ก่อนมีบอร์ด; การมีแผนแม่บทไม่ใช่การอ้างว่าระยะ 3–7 สำเร็จแล้ว</w:t>
+        <w:t>Implementation Roadmap เจ็ดระยะในรายงานทบทวนวรรณกรรมเดิมยังเป็นแผนแม่บท: (1) ทบทวนวรรณกรรมและสถาปัตยกรรมเสร็จแล้ว (2) ต้นแบบ YOLO/OCR เริ่มนำร่องบน PC (3) Local LLM และ JSON (4) MQTT/Home Assistant และการวิเคราะห์ปลายน้ำ (5) เก็บและประเมินข้อมูลนำร่อง (6) จริยธรรมสำหรับการศึกษากับผู้ใช้เมื่อเกี่ยวข้อง และ (7) ประเมิน trade-off แบบครบระบบ [12] ตารางต่อไปแตกงานระยะ PC ที่ทำได้ก่อนมีบอร์ด โดยระยะ 3–7 ยังไม่ใช่ผลการดำเนินงานที่สำเร็จแล้ว</w:t>
       </w:r>
     </w:p>
     <w:p>
@@ -2703,7 +3075,7 @@
     </w:p>
     <w:p>
       <w:pPr>
-        <w:keepLines w:val="0"/>
+        <w:keepLines/>
       </w:pPr>
       <w:r>
         <w:rPr>
@@ -2716,7 +3088,7 @@
       <w:pPr>
         <w:pStyle w:val="Heading1"/>
         <w:keepNext/>
-        <w:keepLines w:val="0"/>
+        <w:keepLines/>
       </w:pPr>
       <w:r>
         <w:rPr>
@@ -2727,7 +3099,7 @@
     </w:p>
     <w:p>
       <w:pPr>
-        <w:keepLines w:val="0"/>
+        <w:keepLines/>
       </w:pPr>
       <w:r>
         <w:rPr>
@@ -2740,8 +3112,7 @@
       <w:pPr>
         <w:pStyle w:val="Heading1"/>
         <w:keepNext/>
-        <w:keepLines w:val="0"/>
-        <w:pageBreakBefore/>
+        <w:keepLines/>
       </w:pPr>
       <w:r>
         <w:rPr>
@@ -2752,8 +3123,8 @@
     </w:p>
     <w:p>
       <w:pPr>
-        <w:keepLines w:val="0"/>
-        <w:spacing w:after="40"/>
+        <w:keepLines/>
+        <w:spacing w:line="240" w:lineRule="auto" w:after="0"/>
         <w:ind w:left="360" w:hanging="360"/>
       </w:pPr>
       <w:r>
@@ -2765,8 +3136,8 @@
     </w:p>
     <w:p>
       <w:pPr>
-        <w:keepLines w:val="0"/>
-        <w:spacing w:after="40"/>
+        <w:keepLines/>
+        <w:spacing w:line="240" w:lineRule="auto" w:after="0"/>
         <w:ind w:left="360" w:hanging="360"/>
       </w:pPr>
       <w:r>
@@ -2778,8 +3149,8 @@
     </w:p>
     <w:p>
       <w:pPr>
-        <w:keepLines w:val="0"/>
-        <w:spacing w:after="40"/>
+        <w:keepLines/>
+        <w:spacing w:line="240" w:lineRule="auto" w:after="0"/>
         <w:ind w:left="360" w:hanging="360"/>
       </w:pPr>
       <w:r>
@@ -2791,8 +3162,8 @@
     </w:p>
     <w:p>
       <w:pPr>
-        <w:keepLines w:val="0"/>
-        <w:spacing w:after="40"/>
+        <w:keepLines/>
+        <w:spacing w:line="240" w:lineRule="auto" w:after="0"/>
         <w:ind w:left="360" w:hanging="360"/>
       </w:pPr>
       <w:r>
@@ -2804,8 +3175,8 @@
     </w:p>
     <w:p>
       <w:pPr>
-        <w:keepLines w:val="0"/>
-        <w:spacing w:after="40"/>
+        <w:keepLines/>
+        <w:spacing w:line="240" w:lineRule="auto" w:after="0"/>
         <w:ind w:left="360" w:hanging="360"/>
       </w:pPr>
       <w:r>
@@ -2817,8 +3188,8 @@
     </w:p>
     <w:p>
       <w:pPr>
-        <w:keepLines w:val="0"/>
-        <w:spacing w:after="40"/>
+        <w:keepLines/>
+        <w:spacing w:line="240" w:lineRule="auto" w:after="0"/>
         <w:ind w:left="360" w:hanging="360"/>
       </w:pPr>
       <w:r>
@@ -2830,8 +3201,8 @@
     </w:p>
     <w:p>
       <w:pPr>
-        <w:keepLines w:val="0"/>
-        <w:spacing w:after="40"/>
+        <w:keepLines/>
+        <w:spacing w:line="240" w:lineRule="auto" w:after="0"/>
         <w:ind w:left="360" w:hanging="360"/>
       </w:pPr>
       <w:r>
@@ -2843,8 +3214,8 @@
     </w:p>
     <w:p>
       <w:pPr>
-        <w:keepLines w:val="0"/>
-        <w:spacing w:after="40"/>
+        <w:keepLines/>
+        <w:spacing w:line="240" w:lineRule="auto" w:after="0"/>
         <w:ind w:left="360" w:hanging="360"/>
       </w:pPr>
       <w:r>
@@ -2856,8 +3227,8 @@
     </w:p>
     <w:p>
       <w:pPr>
-        <w:keepLines w:val="0"/>
-        <w:spacing w:after="40"/>
+        <w:keepLines/>
+        <w:spacing w:line="240" w:lineRule="auto" w:after="0"/>
         <w:ind w:left="360" w:hanging="360"/>
       </w:pPr>
       <w:r>
@@ -2869,8 +3240,8 @@
     </w:p>
     <w:p>
       <w:pPr>
-        <w:keepLines w:val="0"/>
-        <w:spacing w:after="40"/>
+        <w:keepLines/>
+        <w:spacing w:line="240" w:lineRule="auto" w:after="0"/>
         <w:ind w:left="360" w:hanging="360"/>
       </w:pPr>
       <w:r>
@@ -2882,8 +3253,8 @@
     </w:p>
     <w:p>
       <w:pPr>
-        <w:keepLines w:val="0"/>
-        <w:spacing w:after="40"/>
+        <w:keepLines/>
+        <w:spacing w:line="240" w:lineRule="auto" w:after="0"/>
         <w:ind w:left="360" w:hanging="360"/>
       </w:pPr>
       <w:r>
@@ -2895,8 +3266,8 @@
     </w:p>
     <w:p>
       <w:pPr>
-        <w:keepLines w:val="0"/>
-        <w:spacing w:after="40"/>
+        <w:keepLines/>
+        <w:spacing w:line="240" w:lineRule="auto" w:after="0"/>
         <w:ind w:left="360" w:hanging="360"/>
       </w:pPr>
       <w:r>
@@ -2908,8 +3279,8 @@
     </w:p>
     <w:p>
       <w:pPr>
-        <w:keepLines w:val="0"/>
-        <w:spacing w:after="40"/>
+        <w:keepLines/>
+        <w:spacing w:line="240" w:lineRule="auto" w:after="0"/>
         <w:ind w:left="360" w:hanging="360"/>
       </w:pPr>
       <w:r>
@@ -2921,8 +3292,8 @@
     </w:p>
     <w:p>
       <w:pPr>
-        <w:keepLines w:val="0"/>
-        <w:spacing w:after="40"/>
+        <w:keepLines/>
+        <w:spacing w:line="240" w:lineRule="auto" w:after="0"/>
         <w:ind w:left="360" w:hanging="360"/>
       </w:pPr>
       <w:r>
@@ -2934,8 +3305,8 @@
     </w:p>
     <w:p>
       <w:pPr>
-        <w:keepLines w:val="0"/>
-        <w:spacing w:after="40"/>
+        <w:keepLines/>
+        <w:spacing w:line="240" w:lineRule="auto" w:after="0"/>
         <w:ind w:left="360" w:hanging="360"/>
       </w:pPr>
       <w:r>
@@ -2947,8 +3318,8 @@
     </w:p>
     <w:p>
       <w:pPr>
-        <w:keepLines w:val="0"/>
-        <w:spacing w:after="40"/>
+        <w:keepLines/>
+        <w:spacing w:line="240" w:lineRule="auto" w:after="0"/>
         <w:ind w:left="360" w:hanging="360"/>
       </w:pPr>
       <w:r>
@@ -2960,8 +3331,8 @@
     </w:p>
     <w:p>
       <w:pPr>
-        <w:keepLines w:val="0"/>
-        <w:spacing w:after="40"/>
+        <w:keepLines/>
+        <w:spacing w:line="240" w:lineRule="auto" w:after="0"/>
         <w:ind w:left="360" w:hanging="360"/>
       </w:pPr>
       <w:r>
@@ -2973,7 +3344,72 @@
     </w:p>
     <w:p>
       <w:pPr>
-        <w:keepLines w:val="0"/>
+        <w:keepLines/>
+        <w:spacing w:line="240" w:lineRule="auto" w:after="0"/>
+        <w:ind w:left="360" w:hanging="360"/>
+      </w:pPr>
+      <w:r>
+        <w:rPr>
+          <w:rFonts w:ascii="TH Sarabun New" w:hAnsi="TH Sarabun New" w:eastAsia="TH Sarabun New" w:cs="TH Sarabun New"/>
+        </w:rPr>
+        <w:t>[18] Cai, F., Yuan, D., Yang, Z., &amp; Cui, L. (2024). Edge-LLM: A collaborative framework for large language model serving in edge computing. In 2024 IEEE International Conference on Web Services (ICWS) (pp. 799–809). https://doi.org/10.1109/ICWS62655.2024.00099</w:t>
+      </w:r>
+    </w:p>
+    <w:p>
+      <w:pPr>
+        <w:keepLines/>
+        <w:spacing w:line="240" w:lineRule="auto" w:after="0"/>
+        <w:ind w:left="360" w:hanging="360"/>
+      </w:pPr>
+      <w:r>
+        <w:rPr>
+          <w:rFonts w:ascii="TH Sarabun New" w:hAnsi="TH Sarabun New" w:eastAsia="TH Sarabun New" w:cs="TH Sarabun New"/>
+        </w:rPr>
+        <w:t>[19] Moon, S., Cha, J., Park, H., &amp; Kim, J.-Y. (2025). Hybe: GPU-NPU hybrid system for efficient LLM inference with million-token context window. In Proceedings of the 52nd Annual International Symposium on Computer Architecture (pp. 808–820). https://doi.org/10.1145/3695053.3731051</w:t>
+      </w:r>
+    </w:p>
+    <w:p>
+      <w:pPr>
+        <w:keepLines/>
+        <w:spacing w:line="240" w:lineRule="auto" w:after="0"/>
+        <w:ind w:left="360" w:hanging="360"/>
+      </w:pPr>
+      <w:r>
+        <w:rPr>
+          <w:rFonts w:ascii="TH Sarabun New" w:hAnsi="TH Sarabun New" w:eastAsia="TH Sarabun New" w:cs="TH Sarabun New"/>
+        </w:rPr>
+        <w:t>[20] Oloko-Oba, M., Esenogho, E., &amp; Aruleba, K. (2026). From biosignals to bedside: A review of real-time edge machine learning for wearable health monitoring. Bioengineering, 13(5), 559. https://doi.org/10.3390/bioengineering13050559</w:t>
+      </w:r>
+    </w:p>
+    <w:p>
+      <w:pPr>
+        <w:keepLines/>
+        <w:spacing w:line="240" w:lineRule="auto" w:after="0"/>
+        <w:ind w:left="360" w:hanging="360"/>
+      </w:pPr>
+      <w:r>
+        <w:rPr>
+          <w:rFonts w:ascii="TH Sarabun New" w:hAnsi="TH Sarabun New" w:eastAsia="TH Sarabun New" w:cs="TH Sarabun New"/>
+        </w:rPr>
+        <w:t>[21] Zheng, Y., Chen, Y., Qian, B., Shi, X., Shu, Y., &amp; Chen, J. (2025). A review on edge large language models: Design, execution, and applications. ACM Computing Surveys, 57(8), Article 209. https://doi.org/10.1145/3719664</w:t>
+      </w:r>
+    </w:p>
+    <w:p>
+      <w:pPr>
+        <w:keepLines/>
+        <w:spacing w:line="240" w:lineRule="auto" w:after="0"/>
+        <w:ind w:left="360" w:hanging="360"/>
+      </w:pPr>
+      <w:r>
+        <w:rPr>
+          <w:rFonts w:ascii="TH Sarabun New" w:hAnsi="TH Sarabun New" w:eastAsia="TH Sarabun New" w:cs="TH Sarabun New"/>
+        </w:rPr>
+        <w:t>[22] Hu, A., Xu, H., Zhang, L., Ye, J., Yan, M., Zhang, J., Jin, Q., Huang, F., &amp; Zhou, J. (2025). mPLUG-DocOwl2: High-resolution compressing for OCR-free multi-page document understanding. In Proceedings of the 63rd Annual Meeting of the Association for Computational Linguistics (Volume 1: Long Papers) (pp. 5817–5834). https://doi.org/10.18653/v1/2025.acl-long.291</w:t>
+      </w:r>
+    </w:p>
+    <w:p>
+      <w:pPr>
+        <w:keepLines/>
         <w:jc w:val="right"/>
       </w:pPr>
       <w:r>
@@ -2985,7 +3421,7 @@
     </w:p>
     <w:p>
       <w:pPr>
-        <w:keepLines w:val="0"/>
+        <w:keepLines/>
         <w:jc w:val="right"/>
       </w:pPr>
       <w:r>
@@ -2997,7 +3433,7 @@
     </w:p>
     <w:p>
       <w:pPr>
-        <w:keepLines w:val="0"/>
+        <w:keepLines/>
         <w:jc w:val="right"/>
       </w:pPr>
       <w:r>

</xml_diff>

<commit_message>
Audit Ass5 and Ass6 against sources and correct evidence claims
</commit_message>
<xml_diff>
--- a/ass6_output/Residential_Intelligence_Computer_Project_Proposal_READY_2026-10-18.docx
+++ b/ass6_output/Residential_Intelligence_Computer_Project_Proposal_READY_2026-10-18.docx
@@ -127,7 +127,7 @@
         <w:rPr>
           <w:rFonts w:ascii="TH Sarabun New" w:hAnsi="TH Sarabun New" w:eastAsia="TH Sarabun New" w:cs="TH Sarabun New"/>
         </w:rPr>
-        <w:t>โครงงานเสนอระบบประสาทส่วนกลางอัจฉริยะในที่พักอาศัยที่รับข้อมูลจากประสาทสัมผัสดิจิทัลหลายชนิด หรือ e-Senses แล้วแปลงเป็นข้อมูลที่ตรวจสอบและใช้วิเคราะห์ได้ e-Eye รับภาพเอกสารซื้อสินค้า e-Nose อาจรับข้อมูลก๊าซหรือกลิ่น และ e-Skin อาจรับน้ำหนักหรือแรงสัมผัส ระยะแรกเลือก e-Eye เพื่อทำการทดลองที่มีข้อมูลจริง ส่วนโหนดอื่นยังเป็นส่วนขยายในกรอบระบบ ไม่ใช่ผลทดลองที่สำเร็จแล้ว [12]</w:t>
+        <w:t>โครงงานเสนอระบบประสาทส่วนกลางอัจฉริยะในที่พักอาศัยที่รับข้อมูลจากประสาทสัมผัสดิจิทัลหลายชนิด หรือ e-Senses แล้วแปลงเป็นข้อมูลที่ตรวจสอบและใช้วิเคราะห์ได้ e-Eye รับภาพเอกสารซื้อสินค้า e-Nose อาจรับข้อมูลก๊าซหรือกลิ่น และ e-Skin อาจรับน้ำหนักหรือแรงสัมผัส ระยะแรกเลือก e-Eye เพื่อทำการทดลองที่มีข้อมูลจริง ส่วนโหนดอื่นยังเป็นส่วนขยายในกรอบระบบ ไม่ใช่ผลทดลองที่สำเร็จแล้ว</w:t>
       </w:r>
     </w:p>
     <w:p>
@@ -160,7 +160,7 @@
         <w:rPr>
           <w:rFonts w:ascii="TH Sarabun New" w:hAnsi="TH Sarabun New" w:eastAsia="TH Sarabun New" w:cs="TH Sarabun New"/>
         </w:rPr>
-        <w:t>รายงานทบทวนวรรณกรรม 32 หน้าของโครงงานสังเคราะห์บทความวิจัย 12 ฉบับในสามมิติ คือ quantization และฮาร์ดแวร์ การสร้างผลลัพธ์แบบมีโครงสร้าง และบริบทบ้านอัจฉริยะ/IoT งานที่ทบทวนให้แนวทางวัด trade-off แต่ยังไม่ตอบโดยตรงว่าขั้นตอนเหล่านี้ทำงานร่วมกันได้ดีเพียงใดกับใบซื้อสินค้าจริงภาษาไทย/อังกฤษภายใต้ทรัพยากรจำกัด ช่องว่างนี้กล่าวเฉพาะชุดวรรณกรรมที่ทบทวน ไม่ใช่ข้อสรุปว่าไม่มีงานอื่นศึกษาเรื่องเดียวกัน [1–3, 12]</w:t>
+        <w:t>รายงานทบทวนวรรณกรรม 32 หน้าของโครงงานใช้บทความวิจัย 12 ฉบับ โดย 11 ฉบับสังเคราะห์ในสามมิติ คือ quantization และฮาร์ดแวร์ การสร้างผลลัพธ์แบบมีโครงสร้าง และบริบทบ้านอัจฉริยะ/IoT ส่วน P5 สนับสนุนแนวคิดข้ามศาสตร์ งานที่ทบทวนให้แนวทางวัด trade-off แต่ยังไม่ตอบโดยตรงว่าขั้นตอนเหล่านี้ทำงานร่วมกันได้ดีเพียงใดกับใบซื้อสินค้าจริงภาษาไทย/อังกฤษภายใต้ทรัพยากรจำกัด ช่องว่างนี้กล่าวเฉพาะชุดวรรณกรรมที่ทบทวน ไม่ใช่ข้อสรุปว่าไม่มีงานอื่นศึกษาเรื่องเดียวกัน [1–3, 12]</w:t>
       </w:r>
     </w:p>
     <w:p>
@@ -789,7 +789,7 @@
         <w:rPr>
           <w:rFonts w:ascii="TH Sarabun New" w:hAnsi="TH Sarabun New" w:eastAsia="TH Sarabun New" w:cs="TH Sarabun New"/>
         </w:rPr>
-        <w:t>รายงานเดิมคัดบทความจาก 57 รายการจนเหลือ 12 ฉบับที่ใช้สังเคราะห์กรอบสามมิติ งานแต่ละฉบับตอบคำถามต่างกัน จึงพิจารณาทั้งวิธีทดลอง ฮาร์ดแวร์ ผลลัพธ์ที่วัด และขอบเขตการนำมาใช้กับระบบใบซื้อสินค้า ไม่รวมคะแนนจากต่างแพลตฟอร์มเป็นผลของโครงงาน [12]</w:t>
+        <w:t>รายงานเดิมคัดบทความจาก 57 รายการจนเหลือ 12 ฉบับ โดย 11 ฉบับสังเคราะห์กรอบสามมิติและ P5 เป็นหลักฐานสนับสนุนข้ามศาสตร์ งานแต่ละฉบับตอบคำถามต่างกัน จึงพิจารณาทั้งวิธีทดลอง ฮาร์ดแวร์ ผลลัพธ์ที่วัด และขอบเขตการนำมาใช้กับระบบใบซื้อสินค้า ไม่รวมคะแนนจากต่างแพลตฟอร์มเป็นผลของโครงงาน [12]</w:t>
       </w:r>
     </w:p>
     <w:p>
@@ -1697,7 +1697,7 @@
         <w:rPr>
           <w:rFonts w:ascii="TH Sarabun New" w:hAnsi="TH Sarabun New" w:eastAsia="TH Sarabun New" w:cs="TH Sarabun New"/>
         </w:rPr>
-        <w:t>การตรวจชื่อสินค้าเบื้องต้นในภาพผู้สมัคร 59 ภาพพบว่า ถอดชื่อครบครั้งแรก 12 ภาพ อ่านได้บางส่วนแต่ยังไม่ครบ 45 ภาพ และอีก 2 ภาพไม่มีบรรทัดชื่อสินค้า ตัวเลขอักษรจากส่วนที่อ่านได้ยังใช้แทนสัดส่วนภาษาของทั้งชุดไม่ได้ และยังไม่มีผู้ตรวจซ้ำ</w:t>
+        <w:t>การตรวจชื่อสินค้าเบื้องต้นในภาพผู้สมัคร 59 ภาพพบว่า ถอดชื่อครบครั้งแรก 12 ภาพ ถอดไม่ครบ 45 ภาพ โดย 28 ภาพมีช่วงชื่อที่อ่านได้แน่ชัดและ 17 ภาพยังไม่มีช่วงชื่อที่ยืนยันได้ อีก 2 ภาพไม่มีบรรทัดชื่อสินค้า ตัวเลขอักษรจากส่วนที่อ่านได้ยังใช้แทนสัดส่วนภาษาของทั้งชุดไม่ได้ และยังไม่มีผู้ตรวจซ้ำ</w:t>
       </w:r>
     </w:p>
     <w:p>
@@ -3170,7 +3170,7 @@
         <w:rPr>
           <w:rFonts w:ascii="TH Sarabun New" w:hAnsi="TH Sarabun New" w:eastAsia="TH Sarabun New" w:cs="TH Sarabun New"/>
         </w:rPr>
-        <w:t>[4] ณัชพล เพ็งพล และ ธนบดี เริ่มรักสกุล. (2569). ผลนำร่อง e-Eye บน PC ณ วันที่ 17 ตุลาคม 2569. บันทึกผลภายในโครงงาน.</w:t>
+        <w:t>[4] ณัชพล เพ็งพล และ ธนบดี เริ่มรักสกุล. (2569). ผลนำร่อง e-Eye บน PC ณ วันที่ 17 ตุลาคม 2569. บันทึกผลภายในโครงงาน. https://github.com/natchapolp-glitch/Capstone-Project/blob/main/ass5_ready_evidence.md</w:t>
       </w:r>
     </w:p>
     <w:p>
@@ -3446,7 +3446,7 @@
     <w:sectPr>
       <w:headerReference w:type="default" r:id="rId9"/>
       <w:pgSz w:w="11909" w:h="16834"/>
-      <w:pgMar w:top="2160" w:right="1440" w:bottom="1440" w:left="2160" w:header="720" w:footer="720" w:gutter="0"/>
+      <w:pgMar w:top="2160" w:right="1440" w:bottom="1440" w:left="2160" w:header="1440" w:footer="720" w:gutter="0"/>
       <w:cols w:space="720"/>
       <w:titlePg/>
       <w:docGrid w:linePitch="360"/>
@@ -3855,6 +3855,12 @@
       </w:tabs>
       <w:spacing w:after="0" w:line="240" w:lineRule="auto"/>
     </w:pPr>
+    <w:rPr>
+      <w:rFonts w:ascii="TH Sarabun New" w:hAnsi="TH Sarabun New" w:eastAsia="TH Sarabun New" w:cs="TH Sarabun New"/>
+      <w:b w:val="0"/>
+      <w:color w:val="000000"/>
+      <w:sz w:val="28"/>
+    </w:rPr>
   </w:style>
   <w:style w:type="character" w:customStyle="1" w:styleId="HeaderChar">
     <w:name w:val="Header Char"/>

</xml_diff>

<commit_message>
Align Ass5 planned output and Ass6 JSON evaluation with reviewed evidence
</commit_message>
<xml_diff>
--- a/ass6_output/Residential_Intelligence_Computer_Project_Proposal_READY_2026-10-18.docx
+++ b/ass6_output/Residential_Intelligence_Computer_Project_Proposal_READY_2026-10-18.docx
@@ -405,6 +405,8 @@
           <w:rFonts w:ascii="TH Sarabun New" w:hAnsi="TH Sarabun New" w:eastAsia="TH Sarabun New" w:cs="TH Sarabun New"/>
           <w:b/>
           <w:sz w:val="28"/>
+          <w:szCs w:val="28"/>
+          <w:bCs w:val="1"/>
         </w:rPr>
         <w:t xml:space="preserve">ตารางที่ 1  </w:t>
       </w:r>
@@ -412,6 +414,7 @@
         <w:rPr>
           <w:rFonts w:ascii="TH Sarabun New" w:hAnsi="TH Sarabun New" w:eastAsia="TH Sarabun New" w:cs="TH Sarabun New"/>
           <w:sz w:val="28"/>
+          <w:szCs w:val="28"/>
         </w:rPr>
         <w:t>ฐานวรรณกรรมเดิมและการใช้ในเค้าโครงนี้</w:t>
       </w:r>
@@ -455,7 +458,9 @@
               <w:rPr>
                 <w:rFonts w:ascii="TH Sarabun New" w:hAnsi="TH Sarabun New" w:eastAsia="TH Sarabun New" w:cs="TH Sarabun New"/>
                 <w:b/>
-                <w:sz w:val="26"/>
+                <w:sz w:val="28"/>
+                <w:szCs w:val="28"/>
+                <w:bCs w:val="1"/>
               </w:rPr>
               <w:t>มิติเดิม</w:t>
             </w:r>
@@ -483,7 +488,9 @@
               <w:rPr>
                 <w:rFonts w:ascii="TH Sarabun New" w:hAnsi="TH Sarabun New" w:eastAsia="TH Sarabun New" w:cs="TH Sarabun New"/>
                 <w:b/>
-                <w:sz w:val="26"/>
+                <w:sz w:val="28"/>
+                <w:szCs w:val="28"/>
+                <w:bCs w:val="1"/>
               </w:rPr>
               <w:t>แนวคิดที่คงไว้</w:t>
             </w:r>
@@ -511,7 +518,9 @@
               <w:rPr>
                 <w:rFonts w:ascii="TH Sarabun New" w:hAnsi="TH Sarabun New" w:eastAsia="TH Sarabun New" w:cs="TH Sarabun New"/>
                 <w:b/>
-                <w:sz w:val="26"/>
+                <w:sz w:val="28"/>
+                <w:szCs w:val="28"/>
+                <w:bCs w:val="1"/>
               </w:rPr>
               <w:t>การทดสอบในโครงงาน</w:t>
             </w:r>
@@ -539,7 +548,8 @@
             <w:r>
               <w:rPr>
                 <w:rFonts w:ascii="TH Sarabun New" w:hAnsi="TH Sarabun New" w:eastAsia="TH Sarabun New" w:cs="TH Sarabun New"/>
-                <w:sz w:val="26"/>
+                <w:sz w:val="28"/>
+                <w:szCs w:val="28"/>
               </w:rPr>
               <w:t>Quantization / hardware</w:t>
             </w:r>
@@ -565,7 +575,8 @@
             <w:r>
               <w:rPr>
                 <w:rFonts w:ascii="TH Sarabun New" w:hAnsi="TH Sarabun New" w:eastAsia="TH Sarabun New" w:cs="TH Sarabun New"/>
-                <w:sz w:val="26"/>
+                <w:sz w:val="28"/>
+                <w:szCs w:val="28"/>
               </w:rPr>
               <w:t>Husom, Giedra, ShadowNPU [1, 2, 17]</w:t>
             </w:r>
@@ -591,7 +602,8 @@
             <w:r>
               <w:rPr>
                 <w:rFonts w:ascii="TH Sarabun New" w:hAnsi="TH Sarabun New" w:eastAsia="TH Sarabun New" w:cs="TH Sarabun New"/>
-                <w:sz w:val="26"/>
+                <w:sz w:val="28"/>
+                <w:szCs w:val="28"/>
               </w:rPr>
               <w:t>ความถูกต้อง JSON คู่กับเวลา RAM และพลังงานเมื่อมีบอร์ด</w:t>
             </w:r>
@@ -620,7 +632,8 @@
             <w:r>
               <w:rPr>
                 <w:rFonts w:ascii="TH Sarabun New" w:hAnsi="TH Sarabun New" w:eastAsia="TH Sarabun New" w:cs="TH Sarabun New"/>
-                <w:sz w:val="26"/>
+                <w:sz w:val="28"/>
+                <w:szCs w:val="28"/>
               </w:rPr>
               <w:t>Structured output</w:t>
             </w:r>
@@ -647,7 +660,8 @@
             <w:r>
               <w:rPr>
                 <w:rFonts w:ascii="TH Sarabun New" w:hAnsi="TH Sarabun New" w:eastAsia="TH Sarabun New" w:cs="TH Sarabun New"/>
-                <w:sz w:val="26"/>
+                <w:sz w:val="28"/>
+                <w:szCs w:val="28"/>
               </w:rPr>
               <w:t>SGLang และ grammar [3, 5]</w:t>
             </w:r>
@@ -674,7 +688,8 @@
             <w:r>
               <w:rPr>
                 <w:rFonts w:ascii="TH Sarabun New" w:hAnsi="TH Sarabun New" w:eastAsia="TH Sarabun New" w:cs="TH Sarabun New"/>
-                <w:sz w:val="26"/>
+                <w:sz w:val="28"/>
+                <w:szCs w:val="28"/>
               </w:rPr>
               <w:t>เปิด/ปิดการบังคับ schema และตรวจค่าจริง</w:t>
             </w:r>
@@ -702,7 +717,8 @@
             <w:r>
               <w:rPr>
                 <w:rFonts w:ascii="TH Sarabun New" w:hAnsi="TH Sarabun New" w:eastAsia="TH Sarabun New" w:cs="TH Sarabun New"/>
-                <w:sz w:val="26"/>
+                <w:sz w:val="28"/>
+                <w:szCs w:val="28"/>
               </w:rPr>
               <w:t>Smart home / IoT</w:t>
             </w:r>
@@ -728,7 +744,8 @@
             <w:r>
               <w:rPr>
                 <w:rFonts w:ascii="TH Sarabun New" w:hAnsi="TH Sarabun New" w:eastAsia="TH Sarabun New" w:cs="TH Sarabun New"/>
-                <w:sz w:val="26"/>
+                <w:sz w:val="28"/>
+                <w:szCs w:val="28"/>
               </w:rPr>
               <w:t>Rivkin, Sawalha, Serepas [14–16]</w:t>
             </w:r>
@@ -754,7 +771,8 @@
             <w:r>
               <w:rPr>
                 <w:rFonts w:ascii="TH Sarabun New" w:hAnsi="TH Sarabun New" w:eastAsia="TH Sarabun New" w:cs="TH Sarabun New"/>
-                <w:sz w:val="26"/>
+                <w:sz w:val="28"/>
+                <w:szCs w:val="28"/>
               </w:rPr>
               <w:t>ส่ง JSON ที่ตรวจแล้วผ่าน MQTT; ประเมินข้อมูลที่ต้องมีเพิ่มก่อน burn rate</w:t>
             </w:r>
@@ -1106,6 +1124,8 @@
           <w:rFonts w:ascii="TH Sarabun New" w:hAnsi="TH Sarabun New" w:eastAsia="TH Sarabun New" w:cs="TH Sarabun New"/>
           <w:b/>
           <w:sz w:val="28"/>
+          <w:szCs w:val="28"/>
+          <w:bCs w:val="1"/>
         </w:rPr>
         <w:t xml:space="preserve">ภาพที่ 1  </w:t>
       </w:r>
@@ -1113,6 +1133,7 @@
         <w:rPr>
           <w:rFonts w:ascii="TH Sarabun New" w:hAnsi="TH Sarabun New" w:eastAsia="TH Sarabun New" w:cs="TH Sarabun New"/>
           <w:sz w:val="28"/>
+          <w:szCs w:val="28"/>
         </w:rPr>
         <w:t>กรอบสถาปัตยกรรม e-Senses และเส้นทางศึกษา e-Eye ระยะแรก (ออกแบบโดยผู้วิจัย)</w:t>
       </w:r>
@@ -1139,6 +1160,8 @@
           <w:rFonts w:ascii="TH Sarabun New" w:hAnsi="TH Sarabun New" w:eastAsia="TH Sarabun New" w:cs="TH Sarabun New"/>
           <w:b/>
           <w:sz w:val="28"/>
+          <w:szCs w:val="28"/>
+          <w:bCs w:val="1"/>
         </w:rPr>
         <w:t xml:space="preserve">ตารางที่ 2  </w:t>
       </w:r>
@@ -1146,6 +1169,7 @@
         <w:rPr>
           <w:rFonts w:ascii="TH Sarabun New" w:hAnsi="TH Sarabun New" w:eastAsia="TH Sarabun New" w:cs="TH Sarabun New"/>
           <w:sz w:val="28"/>
+          <w:szCs w:val="28"/>
         </w:rPr>
         <w:t>ผลนำร่องและขอบเขตการตีความ</w:t>
       </w:r>
@@ -1189,7 +1213,9 @@
               <w:rPr>
                 <w:rFonts w:ascii="TH Sarabun New" w:hAnsi="TH Sarabun New" w:eastAsia="TH Sarabun New" w:cs="TH Sarabun New"/>
                 <w:b/>
-                <w:sz w:val="26"/>
+                <w:sz w:val="28"/>
+                <w:szCs w:val="28"/>
+                <w:bCs w:val="1"/>
               </w:rPr>
               <w:t>รายการ</w:t>
             </w:r>
@@ -1217,7 +1243,9 @@
               <w:rPr>
                 <w:rFonts w:ascii="TH Sarabun New" w:hAnsi="TH Sarabun New" w:eastAsia="TH Sarabun New" w:cs="TH Sarabun New"/>
                 <w:b/>
-                <w:sz w:val="26"/>
+                <w:sz w:val="28"/>
+                <w:szCs w:val="28"/>
+                <w:bCs w:val="1"/>
               </w:rPr>
               <w:t>ผล ณ 17 ต.ค. 2569</w:t>
             </w:r>
@@ -1245,7 +1273,9 @@
               <w:rPr>
                 <w:rFonts w:ascii="TH Sarabun New" w:hAnsi="TH Sarabun New" w:eastAsia="TH Sarabun New" w:cs="TH Sarabun New"/>
                 <w:b/>
-                <w:sz w:val="26"/>
+                <w:sz w:val="28"/>
+                <w:szCs w:val="28"/>
+                <w:bCs w:val="1"/>
               </w:rPr>
               <w:t>ข้อจำกัด</w:t>
             </w:r>
@@ -1273,7 +1303,8 @@
             <w:r>
               <w:rPr>
                 <w:rFonts w:ascii="TH Sarabun New" w:hAnsi="TH Sarabun New" w:eastAsia="TH Sarabun New" w:cs="TH Sarabun New"/>
-                <w:sz w:val="26"/>
+                <w:sz w:val="28"/>
+                <w:szCs w:val="28"/>
               </w:rPr>
               <w:t>ข้อมูล</w:t>
             </w:r>
@@ -1299,7 +1330,8 @@
             <w:r>
               <w:rPr>
                 <w:rFonts w:ascii="TH Sarabun New" w:hAnsi="TH Sarabun New" w:eastAsia="TH Sarabun New" w:cs="TH Sarabun New"/>
-                <w:sz w:val="26"/>
+                <w:sz w:val="28"/>
+                <w:szCs w:val="28"/>
               </w:rPr>
               <w:t>124 ไฟล์ / 113 ไม่ซ้ำ / 59 ผู้สมัคร</w:t>
             </w:r>
@@ -1325,7 +1357,8 @@
             <w:r>
               <w:rPr>
                 <w:rFonts w:ascii="TH Sarabun New" w:hAnsi="TH Sarabun New" w:eastAsia="TH Sarabun New" w:cs="TH Sarabun New"/>
-                <w:sz w:val="26"/>
+                <w:sz w:val="28"/>
+                <w:szCs w:val="28"/>
               </w:rPr>
               <w:t>ภาพไม่เท่ากับธุรกรรมอิสระ</w:t>
             </w:r>
@@ -1354,7 +1387,8 @@
             <w:r>
               <w:rPr>
                 <w:rFonts w:ascii="TH Sarabun New" w:hAnsi="TH Sarabun New" w:eastAsia="TH Sarabun New" w:cs="TH Sarabun New"/>
-                <w:sz w:val="26"/>
+                <w:sz w:val="28"/>
+                <w:szCs w:val="28"/>
               </w:rPr>
               <w:t>YOLOv8n PC</w:t>
             </w:r>
@@ -1381,7 +1415,8 @@
             <w:r>
               <w:rPr>
                 <w:rFonts w:ascii="TH Sarabun New" w:hAnsi="TH Sarabun New" w:eastAsia="TH Sarabun New" w:cs="TH Sarabun New"/>
-                <w:sz w:val="26"/>
+                <w:sz w:val="28"/>
+                <w:szCs w:val="28"/>
               </w:rPr>
               <w:t>38 ฝึก / 10 ตรวจ; mAP@0.5 0.928</w:t>
             </w:r>
@@ -1408,7 +1443,8 @@
             <w:r>
               <w:rPr>
                 <w:rFonts w:ascii="TH Sarabun New" w:hAnsi="TH Sarabun New" w:eastAsia="TH Sarabun New" w:cs="TH Sarabun New"/>
-                <w:sz w:val="26"/>
+                <w:sz w:val="28"/>
+                <w:szCs w:val="28"/>
               </w:rPr>
               <w:t>ฉากเดิมคล้ายกัน; label รอตรวจซ้ำ</w:t>
             </w:r>
@@ -1436,7 +1472,8 @@
             <w:r>
               <w:rPr>
                 <w:rFonts w:ascii="TH Sarabun New" w:hAnsi="TH Sarabun New" w:eastAsia="TH Sarabun New" w:cs="TH Sarabun New"/>
-                <w:sz w:val="26"/>
+                <w:sz w:val="28"/>
+                <w:szCs w:val="28"/>
               </w:rPr>
               <w:t>ชุดต่างฉาก</w:t>
             </w:r>
@@ -1462,7 +1499,8 @@
             <w:r>
               <w:rPr>
                 <w:rFonts w:ascii="TH Sarabun New" w:hAnsi="TH Sarabun New" w:eastAsia="TH Sarabun New" w:cs="TH Sarabun New"/>
-                <w:sz w:val="26"/>
+                <w:sz w:val="28"/>
+                <w:szCs w:val="28"/>
               </w:rPr>
               <w:t>6 ภาพ; mAP@0.5 0.237</w:t>
             </w:r>
@@ -1488,7 +1526,8 @@
             <w:r>
               <w:rPr>
                 <w:rFonts w:ascii="TH Sarabun New" w:hAnsi="TH Sarabun New" w:eastAsia="TH Sarabun New" w:cs="TH Sarabun New"/>
-                <w:sz w:val="26"/>
+                <w:sz w:val="28"/>
+                <w:szCs w:val="28"/>
               </w:rPr>
               <w:t>กลุ่มเล็ก; ยังไม่ใช่ final test</w:t>
             </w:r>
@@ -1517,7 +1556,8 @@
             <w:r>
               <w:rPr>
                 <w:rFonts w:ascii="TH Sarabun New" w:hAnsi="TH Sarabun New" w:eastAsia="TH Sarabun New" w:cs="TH Sarabun New"/>
-                <w:sz w:val="26"/>
+                <w:sz w:val="28"/>
+                <w:szCs w:val="28"/>
               </w:rPr>
               <w:t>EasyOCR</w:t>
             </w:r>
@@ -1544,7 +1584,8 @@
             <w:r>
               <w:rPr>
                 <w:rFonts w:ascii="TH Sarabun New" w:hAnsi="TH Sarabun New" w:eastAsia="TH Sarabun New" w:cs="TH Sarabun New"/>
-                <w:sz w:val="26"/>
+                <w:sz w:val="28"/>
+                <w:szCs w:val="28"/>
               </w:rPr>
               <w:t>3 ภาพ; spot-check วันที่/ยอด 4/6</w:t>
             </w:r>
@@ -1571,7 +1612,8 @@
             <w:r>
               <w:rPr>
                 <w:rFonts w:ascii="TH Sarabun New" w:hAnsi="TH Sarabun New" w:eastAsia="TH Sarabun New" w:cs="TH Sarabun New"/>
-                <w:sz w:val="26"/>
+                <w:sz w:val="28"/>
+                <w:szCs w:val="28"/>
               </w:rPr>
               <w:t>ตรวจคนรอบเดียว; ไม่ใช่ CER</w:t>
             </w:r>
@@ -1599,7 +1641,8 @@
             <w:r>
               <w:rPr>
                 <w:rFonts w:ascii="TH Sarabun New" w:hAnsi="TH Sarabun New" w:eastAsia="TH Sarabun New" w:cs="TH Sarabun New"/>
-                <w:sz w:val="26"/>
+                <w:sz w:val="28"/>
+                <w:szCs w:val="28"/>
               </w:rPr>
               <w:t>RKNN PC</w:t>
             </w:r>
@@ -1625,7 +1668,8 @@
             <w:r>
               <w:rPr>
                 <w:rFonts w:ascii="TH Sarabun New" w:hAnsi="TH Sarabun New" w:eastAsia="TH Sarabun New" w:cs="TH Sarabun New"/>
-                <w:sz w:val="26"/>
+                <w:sz w:val="28"/>
+                <w:szCs w:val="28"/>
               </w:rPr>
               <w:t>ONNX → RKNN → PC inference สำเร็จ</w:t>
             </w:r>
@@ -1651,7 +1695,8 @@
             <w:r>
               <w:rPr>
                 <w:rFonts w:ascii="TH Sarabun New" w:hAnsi="TH Sarabun New" w:eastAsia="TH Sarabun New" w:cs="TH Sarabun New"/>
-                <w:sz w:val="26"/>
+                <w:sz w:val="28"/>
+                <w:szCs w:val="28"/>
               </w:rPr>
               <w:t>ไม่ใช่ benchmark NPU จริง</w:t>
             </w:r>
@@ -1708,7 +1753,7 @@
         <w:rPr>
           <w:rFonts w:ascii="TH Sarabun New" w:hAnsi="TH Sarabun New" w:eastAsia="TH Sarabun New" w:cs="TH Sarabun New"/>
         </w:rPr>
-        <w:t>เฉลยแต่ละภาพจะประกอบด้วยกรอบเอกสาร ข้อความอ้างอิง และ JSON schema คงที่: transaction_date, merchant, items[{name, quantity, unit, unit_price, line_total}], grand_total, currency และช่องสถานะอ่านไม่ออก กำหนด null สำหรับข้อมูลไม่ปรากฏ ไม่เดาจากบริบท จะให้ผู้วิจัยสองคนตรวจเฉลยแยกกันแล้วแก้ข้อขัดแย้งร่วมกัน พร้อมบันทึก version, กลุ่มธุรกรรม และเหตุผลการตัดภาพออก การวัดมุมเอียงละเอียดต้องกำหนดแนวอ้างอิงของกระดาษหรือบรรทัด ส่วนสัดส่วนตัวอักษรไทย/อังกฤษจะนับจากข้อความเฉลยที่ตรวจแล้ว ไม่ใช้ OCR ดิบเป็นค่าจริง</w:t>
+        <w:t>เฉลยแต่ละภาพจะประกอบด้วยกรอบเอกสาร ข้อความอ้างอิง และ JSON schema คงที่: transaction_date, merchant, items[{name, quantity, unit, unit_price, line_total}], grand_total, currency ตามไฟล์ receipt_schema.json ทุกคีย์ต้องปรากฏ และกำหนด null สำหรับข้อมูลที่ไม่ปรากฏในเอกสาร สถานะอ่านไม่ออกและสถานะตรวจยืนยันบันทึกใน manifest แยกจากผลสกัด เพื่อแยกข้อมูลที่ไม่มีออกจากข้อมูลที่ยังอ่านไม่ได้ จะให้ผู้วิจัยสองคนตรวจเฉลยแยกกันแล้วแก้ข้อขัดแย้งร่วมกัน พร้อมบันทึก version, กลุ่มธุรกรรม และเหตุผลการตัดภาพออก การวัดมุมเอียงละเอียดต้องกำหนดแนวอ้างอิงของกระดาษหรือบรรทัด ส่วนสัดส่วนตัวอักษรไทย/อังกฤษจะนับจากข้อความเฉลยที่ตรวจแล้ว ไม่ใช้ OCR ดิบเป็นค่าจริง</w:t>
       </w:r>
     </w:p>
     <w:p>
@@ -1749,6 +1794,17 @@
     </w:p>
     <w:p>
       <w:pPr>
+        <w:keepLines/>
+      </w:pPr>
+      <w:r>
+        <w:rPr>
+          <w:rFonts w:ascii="TH Sarabun New" w:hAnsi="TH Sarabun New" w:eastAsia="TH Sarabun New" w:cs="TH Sarabun New"/>
+        </w:rPr>
+        <w:t>ตัวให้คะแนนเบื้องต้นตรวจ schema ก่อนให้คะแนน และตรวจทุกฟิลด์ใน receipt_schema.json โดยปรับข้อความเป็น Unicode NFC และตัดช่องว่างหัวท้าย เปรียบเทียบตัวเลขตามค่า จับคู่รายการที่ตรงทุกฟิลด์ก่อน แล้วจึงจับคู่ชื่อที่เหลือแบบหนึ่งต่อหนึ่งด้วย SequenceMatcher ที่เกณฑ์ 0.6 ฟิลด์ผิดนับทั้ง false positive และ false negative รายการเกินลด precision และรายการขาดลด recall ผล exact-match ต้องตรงทุกฟิลด์และไม่มีรายการเกินหรือขาด ผลที่ไม่ผ่าน schema หรือไม่มีไฟล์คำตอบนับเป็นความล้มเหลว วิธีนี้ใช้กับเฉลยที่ตรวจครบแล้วเท่านั้น ภาพที่ยังถอดไม่ครบจะแยกรายงานจำนวนและไม่ใช้ null กลบส่วนที่อ่านไม่ได้ ปัจจุบันตัวให้คะแนนผ่านการทดสอบด้วยข้อมูลสมมติ ยังไม่มีผลประเมินโมเดล JSON จริง</w:t>
+      </w:r>
+    </w:p>
+    <w:p>
+      <w:pPr>
         <w:keepNext/>
         <w:spacing w:before="180" w:after="280"/>
       </w:pPr>
@@ -1757,6 +1813,8 @@
           <w:rFonts w:ascii="TH Sarabun New" w:hAnsi="TH Sarabun New" w:eastAsia="TH Sarabun New" w:cs="TH Sarabun New"/>
           <w:b/>
           <w:sz w:val="28"/>
+          <w:szCs w:val="28"/>
+          <w:bCs w:val="1"/>
         </w:rPr>
         <w:t xml:space="preserve">ตารางที่ 3  </w:t>
       </w:r>
@@ -1764,6 +1822,7 @@
         <w:rPr>
           <w:rFonts w:ascii="TH Sarabun New" w:hAnsi="TH Sarabun New" w:eastAsia="TH Sarabun New" w:cs="TH Sarabun New"/>
           <w:sz w:val="28"/>
+          <w:szCs w:val="28"/>
         </w:rPr>
         <w:t>จุดตัดสินใจของการทดลอง</w:t>
       </w:r>
@@ -1807,7 +1866,9 @@
               <w:rPr>
                 <w:rFonts w:ascii="TH Sarabun New" w:hAnsi="TH Sarabun New" w:eastAsia="TH Sarabun New" w:cs="TH Sarabun New"/>
                 <w:b/>
-                <w:sz w:val="26"/>
+                <w:sz w:val="28"/>
+                <w:szCs w:val="28"/>
+                <w:bCs w:val="1"/>
               </w:rPr>
               <w:t>ขั้น</w:t>
             </w:r>
@@ -1835,7 +1896,9 @@
               <w:rPr>
                 <w:rFonts w:ascii="TH Sarabun New" w:hAnsi="TH Sarabun New" w:eastAsia="TH Sarabun New" w:cs="TH Sarabun New"/>
                 <w:b/>
-                <w:sz w:val="26"/>
+                <w:sz w:val="28"/>
+                <w:szCs w:val="28"/>
+                <w:bCs w:val="1"/>
               </w:rPr>
               <w:t>เปรียบเทียบ</w:t>
             </w:r>
@@ -1863,7 +1926,9 @@
               <w:rPr>
                 <w:rFonts w:ascii="TH Sarabun New" w:hAnsi="TH Sarabun New" w:eastAsia="TH Sarabun New" w:cs="TH Sarabun New"/>
                 <w:b/>
-                <w:sz w:val="26"/>
+                <w:sz w:val="28"/>
+                <w:szCs w:val="28"/>
+                <w:bCs w:val="1"/>
               </w:rPr>
               <w:t>เกณฑ์ตัดสินหลัก</w:t>
             </w:r>
@@ -1891,7 +1956,8 @@
             <w:r>
               <w:rPr>
                 <w:rFonts w:ascii="TH Sarabun New" w:hAnsi="TH Sarabun New" w:eastAsia="TH Sarabun New" w:cs="TH Sarabun New"/>
-                <w:sz w:val="26"/>
+                <w:sz w:val="28"/>
+                <w:szCs w:val="28"/>
               </w:rPr>
               <w:t>ตรวจจับ</w:t>
             </w:r>
@@ -1917,7 +1983,8 @@
             <w:r>
               <w:rPr>
                 <w:rFonts w:ascii="TH Sarabun New" w:hAnsi="TH Sarabun New" w:eastAsia="TH Sarabun New" w:cs="TH Sarabun New"/>
-                <w:sz w:val="26"/>
+                <w:sz w:val="28"/>
+                <w:szCs w:val="28"/>
               </w:rPr>
               <w:t>ฉากเดิม / ต่างฉาก</w:t>
             </w:r>
@@ -1943,7 +2010,8 @@
             <w:r>
               <w:rPr>
                 <w:rFonts w:ascii="TH Sarabun New" w:hAnsi="TH Sarabun New" w:eastAsia="TH Sarabun New" w:cs="TH Sarabun New"/>
-                <w:sz w:val="26"/>
+                <w:sz w:val="28"/>
+                <w:szCs w:val="28"/>
               </w:rPr>
               <w:t>mAP และกรอบสูงสุด IoU≥0.5</w:t>
             </w:r>
@@ -1972,7 +2040,8 @@
             <w:r>
               <w:rPr>
                 <w:rFonts w:ascii="TH Sarabun New" w:hAnsi="TH Sarabun New" w:eastAsia="TH Sarabun New" w:cs="TH Sarabun New"/>
-                <w:sz w:val="26"/>
+                <w:sz w:val="28"/>
+                <w:szCs w:val="28"/>
               </w:rPr>
               <w:t>OCR</w:t>
             </w:r>
@@ -1999,7 +2068,8 @@
             <w:r>
               <w:rPr>
                 <w:rFonts w:ascii="TH Sarabun New" w:hAnsi="TH Sarabun New" w:eastAsia="TH Sarabun New" w:cs="TH Sarabun New"/>
-                <w:sz w:val="26"/>
+                <w:sz w:val="28"/>
+                <w:szCs w:val="28"/>
               </w:rPr>
               <w:t>EasyOCR / Tesseract</w:t>
             </w:r>
@@ -2026,7 +2096,8 @@
             <w:r>
               <w:rPr>
                 <w:rFonts w:ascii="TH Sarabun New" w:hAnsi="TH Sarabun New" w:eastAsia="TH Sarabun New" w:cs="TH Sarabun New"/>
-                <w:sz w:val="26"/>
+                <w:sz w:val="28"/>
+                <w:szCs w:val="28"/>
               </w:rPr>
               <w:t>CER และความถูกต้องของฟิลด์</w:t>
             </w:r>
@@ -2054,7 +2125,8 @@
             <w:r>
               <w:rPr>
                 <w:rFonts w:ascii="TH Sarabun New" w:hAnsi="TH Sarabun New" w:eastAsia="TH Sarabun New" w:cs="TH Sarabun New"/>
-                <w:sz w:val="26"/>
+                <w:sz w:val="28"/>
+                <w:szCs w:val="28"/>
               </w:rPr>
               <w:t>LLM</w:t>
             </w:r>
@@ -2080,7 +2152,8 @@
             <w:r>
               <w:rPr>
                 <w:rFonts w:ascii="TH Sarabun New" w:hAnsi="TH Sarabun New" w:eastAsia="TH Sarabun New" w:cs="TH Sarabun New"/>
-                <w:sz w:val="26"/>
+                <w:sz w:val="28"/>
+                <w:szCs w:val="28"/>
               </w:rPr>
               <w:t>โมเดล × quantization × grammar</w:t>
             </w:r>
@@ -2106,7 +2179,8 @@
             <w:r>
               <w:rPr>
                 <w:rFonts w:ascii="TH Sarabun New" w:hAnsi="TH Sarabun New" w:eastAsia="TH Sarabun New" w:cs="TH Sarabun New"/>
-                <w:sz w:val="26"/>
+                <w:sz w:val="28"/>
+                <w:szCs w:val="28"/>
               </w:rPr>
               <w:t>schema validity / field accuracy / RAM / latency</w:t>
             </w:r>
@@ -2135,7 +2209,8 @@
             <w:r>
               <w:rPr>
                 <w:rFonts w:ascii="TH Sarabun New" w:hAnsi="TH Sarabun New" w:eastAsia="TH Sarabun New" w:cs="TH Sarabun New"/>
-                <w:sz w:val="26"/>
+                <w:sz w:val="28"/>
+                <w:szCs w:val="28"/>
               </w:rPr>
               <w:t>ส่งออก</w:t>
             </w:r>
@@ -2162,7 +2237,8 @@
             <w:r>
               <w:rPr>
                 <w:rFonts w:ascii="TH Sarabun New" w:hAnsi="TH Sarabun New" w:eastAsia="TH Sarabun New" w:cs="TH Sarabun New"/>
-                <w:sz w:val="26"/>
+                <w:sz w:val="28"/>
+                <w:szCs w:val="28"/>
               </w:rPr>
               <w:t>ONNX / RKNN PC; RKLLM เมื่อพร้อม</w:t>
             </w:r>
@@ -2189,7 +2265,8 @@
             <w:r>
               <w:rPr>
                 <w:rFonts w:ascii="TH Sarabun New" w:hAnsi="TH Sarabun New" w:eastAsia="TH Sarabun New" w:cs="TH Sarabun New"/>
-                <w:sz w:val="26"/>
+                <w:sz w:val="28"/>
+                <w:szCs w:val="28"/>
               </w:rPr>
               <w:t>ผ่าน conversion และผลเลขสมเหตุสมผล</w:t>
             </w:r>
@@ -2548,6 +2625,8 @@
           <w:rFonts w:ascii="TH Sarabun New" w:hAnsi="TH Sarabun New" w:eastAsia="TH Sarabun New" w:cs="TH Sarabun New"/>
           <w:b/>
           <w:sz w:val="28"/>
+          <w:szCs w:val="28"/>
+          <w:bCs w:val="1"/>
         </w:rPr>
         <w:t xml:space="preserve">ตารางที่ 4  </w:t>
       </w:r>
@@ -2555,6 +2634,7 @@
         <w:rPr>
           <w:rFonts w:ascii="TH Sarabun New" w:hAnsi="TH Sarabun New" w:eastAsia="TH Sarabun New" w:cs="TH Sarabun New"/>
           <w:sz w:val="28"/>
+          <w:szCs w:val="28"/>
         </w:rPr>
         <w:t>แผนดำเนินงานระยะ PC นับจากการรับรองเค้าโครง</w:t>
       </w:r>
@@ -2598,7 +2678,9 @@
               <w:rPr>
                 <w:rFonts w:ascii="TH Sarabun New" w:hAnsi="TH Sarabun New" w:eastAsia="TH Sarabun New" w:cs="TH Sarabun New"/>
                 <w:b/>
-                <w:sz w:val="26"/>
+                <w:sz w:val="28"/>
+                <w:szCs w:val="28"/>
+                <w:bCs w:val="1"/>
               </w:rPr>
               <w:t>ช่วง</w:t>
             </w:r>
@@ -2626,7 +2708,9 @@
               <w:rPr>
                 <w:rFonts w:ascii="TH Sarabun New" w:hAnsi="TH Sarabun New" w:eastAsia="TH Sarabun New" w:cs="TH Sarabun New"/>
                 <w:b/>
-                <w:sz w:val="26"/>
+                <w:sz w:val="28"/>
+                <w:szCs w:val="28"/>
+                <w:bCs w:val="1"/>
               </w:rPr>
               <w:t>กิจกรรม</w:t>
             </w:r>
@@ -2654,7 +2738,9 @@
               <w:rPr>
                 <w:rFonts w:ascii="TH Sarabun New" w:hAnsi="TH Sarabun New" w:eastAsia="TH Sarabun New" w:cs="TH Sarabun New"/>
                 <w:b/>
-                <w:sz w:val="26"/>
+                <w:sz w:val="28"/>
+                <w:szCs w:val="28"/>
+                <w:bCs w:val="1"/>
               </w:rPr>
               <w:t>ผลส่งมอบ</w:t>
             </w:r>
@@ -2682,7 +2768,8 @@
             <w:r>
               <w:rPr>
                 <w:rFonts w:ascii="TH Sarabun New" w:hAnsi="TH Sarabun New" w:eastAsia="TH Sarabun New" w:cs="TH Sarabun New"/>
-                <w:sz w:val="26"/>
+                <w:sz w:val="28"/>
+                <w:szCs w:val="28"/>
               </w:rPr>
               <w:t>สัปดาห์ 1</w:t>
             </w:r>
@@ -2708,7 +2795,8 @@
             <w:r>
               <w:rPr>
                 <w:rFonts w:ascii="TH Sarabun New" w:hAnsi="TH Sarabun New" w:eastAsia="TH Sarabun New" w:cs="TH Sarabun New"/>
-                <w:sz w:val="26"/>
+                <w:sz w:val="28"/>
+                <w:szCs w:val="28"/>
               </w:rPr>
               <w:t>ตรวจประเภทภาพ/กลุ่มธุรกรรมและ label</w:t>
             </w:r>
@@ -2734,7 +2822,8 @@
             <w:r>
               <w:rPr>
                 <w:rFonts w:ascii="TH Sarabun New" w:hAnsi="TH Sarabun New" w:eastAsia="TH Sarabun New" w:cs="TH Sarabun New"/>
-                <w:sz w:val="26"/>
+                <w:sz w:val="28"/>
+                <w:szCs w:val="28"/>
               </w:rPr>
               <w:t>manifest และ split ที่ตรวจซ้ำ</w:t>
             </w:r>
@@ -2763,7 +2852,8 @@
             <w:r>
               <w:rPr>
                 <w:rFonts w:ascii="TH Sarabun New" w:hAnsi="TH Sarabun New" w:eastAsia="TH Sarabun New" w:cs="TH Sarabun New"/>
-                <w:sz w:val="26"/>
+                <w:sz w:val="28"/>
+                <w:szCs w:val="28"/>
               </w:rPr>
               <w:t>สัปดาห์ 2–3</w:t>
             </w:r>
@@ -2790,7 +2880,8 @@
             <w:r>
               <w:rPr>
                 <w:rFonts w:ascii="TH Sarabun New" w:hAnsi="TH Sarabun New" w:eastAsia="TH Sarabun New" w:cs="TH Sarabun New"/>
-                <w:sz w:val="26"/>
+                <w:sz w:val="28"/>
+                <w:szCs w:val="28"/>
               </w:rPr>
               <w:t>ทำเฉลยข้อความและ JSON สองรอบ</w:t>
             </w:r>
@@ -2817,7 +2908,8 @@
             <w:r>
               <w:rPr>
                 <w:rFonts w:ascii="TH Sarabun New" w:hAnsi="TH Sarabun New" w:eastAsia="TH Sarabun New" w:cs="TH Sarabun New"/>
-                <w:sz w:val="26"/>
+                <w:sz w:val="28"/>
+                <w:szCs w:val="28"/>
               </w:rPr>
               <w:t>gold set พร้อมคู่มือ annotation</w:t>
             </w:r>
@@ -2845,7 +2937,8 @@
             <w:r>
               <w:rPr>
                 <w:rFonts w:ascii="TH Sarabun New" w:hAnsi="TH Sarabun New" w:eastAsia="TH Sarabun New" w:cs="TH Sarabun New"/>
-                <w:sz w:val="26"/>
+                <w:sz w:val="28"/>
+                <w:szCs w:val="28"/>
               </w:rPr>
               <w:t>สัปดาห์ 3–4</w:t>
             </w:r>
@@ -2871,7 +2964,8 @@
             <w:r>
               <w:rPr>
                 <w:rFonts w:ascii="TH Sarabun New" w:hAnsi="TH Sarabun New" w:eastAsia="TH Sarabun New" w:cs="TH Sarabun New"/>
-                <w:sz w:val="26"/>
+                <w:sz w:val="28"/>
+                <w:szCs w:val="28"/>
               </w:rPr>
               <w:t>เปรียบเทียบ OCR และปรับตรวจจับข้ามฉาก</w:t>
             </w:r>
@@ -2897,7 +2991,8 @@
             <w:r>
               <w:rPr>
                 <w:rFonts w:ascii="TH Sarabun New" w:hAnsi="TH Sarabun New" w:eastAsia="TH Sarabun New" w:cs="TH Sarabun New"/>
-                <w:sz w:val="26"/>
+                <w:sz w:val="28"/>
+                <w:szCs w:val="28"/>
               </w:rPr>
               <w:t>CER / field metrics / detection metrics</w:t>
             </w:r>
@@ -2926,7 +3021,8 @@
             <w:r>
               <w:rPr>
                 <w:rFonts w:ascii="TH Sarabun New" w:hAnsi="TH Sarabun New" w:eastAsia="TH Sarabun New" w:cs="TH Sarabun New"/>
-                <w:sz w:val="26"/>
+                <w:sz w:val="28"/>
+                <w:szCs w:val="28"/>
               </w:rPr>
               <w:t>สัปดาห์ 4–5</w:t>
             </w:r>
@@ -2953,7 +3049,8 @@
             <w:r>
               <w:rPr>
                 <w:rFonts w:ascii="TH Sarabun New" w:hAnsi="TH Sarabun New" w:eastAsia="TH Sarabun New" w:cs="TH Sarabun New"/>
-                <w:sz w:val="26"/>
+                <w:sz w:val="28"/>
+                <w:szCs w:val="28"/>
               </w:rPr>
               <w:t>ทดลองโมเดลภาษาและ constrained output บน PC</w:t>
             </w:r>
@@ -2980,7 +3077,8 @@
             <w:r>
               <w:rPr>
                 <w:rFonts w:ascii="TH Sarabun New" w:hAnsi="TH Sarabun New" w:eastAsia="TH Sarabun New" w:cs="TH Sarabun New"/>
-                <w:sz w:val="26"/>
+                <w:sz w:val="28"/>
+                <w:szCs w:val="28"/>
               </w:rPr>
               <w:t>ตารางความแม่นยำ เวลา และ RAM</w:t>
             </w:r>
@@ -3008,7 +3106,8 @@
             <w:r>
               <w:rPr>
                 <w:rFonts w:ascii="TH Sarabun New" w:hAnsi="TH Sarabun New" w:eastAsia="TH Sarabun New" w:cs="TH Sarabun New"/>
-                <w:sz w:val="26"/>
+                <w:sz w:val="28"/>
+                <w:szCs w:val="28"/>
               </w:rPr>
               <w:t>สัปดาห์ 6</w:t>
             </w:r>
@@ -3034,7 +3133,8 @@
             <w:r>
               <w:rPr>
                 <w:rFonts w:ascii="TH Sarabun New" w:hAnsi="TH Sarabun New" w:eastAsia="TH Sarabun New" w:cs="TH Sarabun New"/>
-                <w:sz w:val="26"/>
+                <w:sz w:val="28"/>
+                <w:szCs w:val="28"/>
               </w:rPr>
               <w:t>ทวน RKNN/RKLLM PC-side และเขียนผล</w:t>
             </w:r>
@@ -3060,7 +3160,8 @@
             <w:r>
               <w:rPr>
                 <w:rFonts w:ascii="TH Sarabun New" w:hAnsi="TH Sarabun New" w:eastAsia="TH Sarabun New" w:cs="TH Sarabun New"/>
-                <w:sz w:val="26"/>
+                <w:sz w:val="28"/>
+                <w:szCs w:val="28"/>
               </w:rPr>
               <w:t>รายงานข้อจำกัดและขั้นทดสอบบอร์ด</w:t>
             </w:r>
@@ -3839,6 +3940,8 @@
       <w:b w:val="0"/>
       <w:color w:val="000000"/>
       <w:sz w:val="28"/>
+      <w:szCs w:val="28"/>
+      <w:bCs w:val="0"/>
     </w:rPr>
   </w:style>
   <w:style w:type="paragraph" w:styleId="Header">
@@ -3860,6 +3963,8 @@
       <w:b w:val="0"/>
       <w:color w:val="000000"/>
       <w:sz w:val="28"/>
+      <w:szCs w:val="28"/>
+      <w:bCs w:val="0"/>
     </w:rPr>
   </w:style>
   <w:style w:type="character" w:customStyle="1" w:styleId="HeaderChar">
@@ -3906,12 +4011,12 @@
       <w:outlineLvl w:val="0"/>
     </w:pPr>
     <w:rPr>
-      <w:rFonts w:asciiTheme="majorHAnsi" w:eastAsiaTheme="majorEastAsia" w:hAnsiTheme="majorHAnsi" w:cstheme="majorBidi" w:ascii="TH Sarabun New" w:hAnsi="TH Sarabun New" w:eastAsia="TH Sarabun New" w:cs="TH Sarabun New"/>
+      <w:rFonts w:ascii="TH Sarabun New" w:hAnsi="TH Sarabun New" w:eastAsia="TH Sarabun New" w:cs="TH Sarabun New"/>
       <w:b/>
-      <w:bCs/>
+      <w:bCs w:val="1"/>
       <w:color w:val="000000"/>
       <w:sz w:val="32"/>
-      <w:szCs w:val="28"/>
+      <w:szCs w:val="32"/>
     </w:rPr>
   </w:style>
   <w:style w:type="paragraph" w:styleId="Heading2">
@@ -3930,12 +4035,12 @@
       <w:outlineLvl w:val="1"/>
     </w:pPr>
     <w:rPr>
-      <w:rFonts w:asciiTheme="majorHAnsi" w:eastAsiaTheme="majorEastAsia" w:hAnsiTheme="majorHAnsi" w:cstheme="majorBidi" w:ascii="TH Sarabun New" w:hAnsi="TH Sarabun New" w:eastAsia="TH Sarabun New" w:cs="TH Sarabun New"/>
-      <w:b/>
-      <w:bCs/>
+      <w:rFonts w:ascii="TH Sarabun New" w:hAnsi="TH Sarabun New" w:eastAsia="TH Sarabun New" w:cs="TH Sarabun New"/>
+      <w:b w:val="0"/>
+      <w:bCs w:val="0"/>
       <w:color w:val="000000"/>
       <w:sz w:val="28"/>
-      <w:szCs w:val="26"/>
+      <w:szCs w:val="28"/>
     </w:rPr>
   </w:style>
   <w:style w:type="paragraph" w:styleId="Heading3">
@@ -4194,13 +4299,14 @@
       <w:contextualSpacing/>
     </w:pPr>
     <w:rPr>
-      <w:rFonts w:asciiTheme="majorHAnsi" w:eastAsiaTheme="majorEastAsia" w:hAnsiTheme="majorHAnsi" w:cstheme="majorBidi" w:ascii="TH Sarabun New" w:hAnsi="TH Sarabun New" w:eastAsia="TH Sarabun New" w:cs="TH Sarabun New"/>
+      <w:rFonts w:ascii="TH Sarabun New" w:hAnsi="TH Sarabun New" w:eastAsia="TH Sarabun New" w:cs="TH Sarabun New"/>
       <w:b/>
       <w:color w:val="000000"/>
       <w:spacing w:val="5"/>
       <w:kern w:val="28"/>
       <w:sz w:val="36"/>
-      <w:szCs w:val="52"/>
+      <w:szCs w:val="36"/>
+      <w:bCs w:val="1"/>
     </w:rPr>
   </w:style>
   <w:style w:type="character" w:customStyle="1" w:styleId="TitleChar">
@@ -4381,6 +4487,8 @@
       <w:b w:val="0"/>
       <w:color w:val="000000"/>
       <w:sz w:val="28"/>
+      <w:szCs w:val="28"/>
+      <w:bCs w:val="0"/>
     </w:rPr>
   </w:style>
   <w:style w:type="paragraph" w:styleId="ListBullet2">

</xml_diff>